<commit_message>
Edit Report and test workflow for converting .docx to README.md
</commit_message>
<xml_diff>
--- a/EmbedDLL_C2_Dropper-Loader_FINAL.docx
+++ b/EmbedDLL_C2_Dropper-Loader_FINAL.docx
@@ -166,9 +166,8 @@
           <w:sz w:val="44"/>
           <w:szCs w:val="44"/>
         </w:rPr>
-        <w:t>C</w:t>
-      </w:r>
-      <w:proofErr w:type="gramStart"/>
+        <w:t>C2</w:t>
+      </w:r>
       <w:r>
         <w:rPr>
           <w:rFonts w:ascii="Montserrat Medium" w:hAnsi="Montserrat Medium" w:cs="Times New Roman"/>
@@ -177,7 +176,7 @@
           <w:sz w:val="44"/>
           <w:szCs w:val="44"/>
         </w:rPr>
-        <w:t>2</w:t>
+        <w:t>.</w:t>
       </w:r>
       <w:r>
         <w:rPr>
@@ -187,7 +186,7 @@
           <w:sz w:val="44"/>
           <w:szCs w:val="44"/>
         </w:rPr>
-        <w:t>.</w:t>
+        <w:t>Bootstrap</w:t>
       </w:r>
       <w:r>
         <w:rPr>
@@ -197,7 +196,7 @@
           <w:sz w:val="44"/>
           <w:szCs w:val="44"/>
         </w:rPr>
-        <w:t>Bootstrap</w:t>
+        <w:t>.</w:t>
       </w:r>
       <w:r>
         <w:rPr>
@@ -207,7 +206,7 @@
           <w:sz w:val="44"/>
           <w:szCs w:val="44"/>
         </w:rPr>
-        <w:t>.</w:t>
+        <w:t>Dropper</w:t>
       </w:r>
       <w:r>
         <w:rPr>
@@ -217,9 +216,8 @@
           <w:sz w:val="44"/>
           <w:szCs w:val="44"/>
         </w:rPr>
-        <w:t>Dropper</w:t>
-      </w:r>
-      <w:proofErr w:type="gramEnd"/>
+        <w:t>.</w:t>
+      </w:r>
       <w:r>
         <w:rPr>
           <w:rFonts w:ascii="Montserrat Medium" w:hAnsi="Montserrat Medium" w:cs="Times New Roman"/>
@@ -228,9 +226,13 @@
           <w:sz w:val="44"/>
           <w:szCs w:val="44"/>
         </w:rPr>
-        <w:t>.</w:t>
-      </w:r>
-      <w:r>
+        <w:t>Loader</w:t>
+      </w:r>
+    </w:p>
+    <w:p>
+      <w:pPr>
+        <w:spacing w:after="160" w:line="259" w:lineRule="auto"/>
+        <w:jc w:val="center"/>
         <w:rPr>
           <w:rFonts w:ascii="Montserrat Medium" w:hAnsi="Montserrat Medium" w:cs="Times New Roman"/>
           <w:bCs/>
@@ -238,8 +240,7 @@
           <w:sz w:val="44"/>
           <w:szCs w:val="44"/>
         </w:rPr>
-        <w:t>Loader</w:t>
-      </w:r>
+      </w:pPr>
     </w:p>
     <w:p>
       <w:pPr>
@@ -249,8 +250,6 @@
           <w:rFonts w:ascii="Montserrat Medium" w:hAnsi="Montserrat Medium" w:cs="Times New Roman"/>
           <w:bCs/>
           <w:color w:val="004E76"/>
-          <w:sz w:val="44"/>
-          <w:szCs w:val="44"/>
         </w:rPr>
       </w:pPr>
     </w:p>
@@ -264,24 +263,21 @@
           <w:color w:val="004E76"/>
         </w:rPr>
       </w:pPr>
-    </w:p>
-    <w:p>
-      <w:pPr>
-        <w:spacing w:after="160" w:line="259" w:lineRule="auto"/>
-        <w:jc w:val="center"/>
+      <w:r>
         <w:rPr>
           <w:rFonts w:ascii="Montserrat Medium" w:hAnsi="Montserrat Medium" w:cs="Times New Roman"/>
           <w:bCs/>
           <w:color w:val="004E76"/>
         </w:rPr>
-      </w:pPr>
+        <w:t>January 2,</w:t>
+      </w:r>
       <w:r>
         <w:rPr>
           <w:rFonts w:ascii="Montserrat Medium" w:hAnsi="Montserrat Medium" w:cs="Times New Roman"/>
           <w:bCs/>
           <w:color w:val="004E76"/>
         </w:rPr>
-        <w:t>January 2,</w:t>
+        <w:t xml:space="preserve"> 202</w:t>
       </w:r>
       <w:r>
         <w:rPr>
@@ -289,26 +285,8 @@
           <w:bCs/>
           <w:color w:val="004E76"/>
         </w:rPr>
-        <w:t xml:space="preserve"> </w:t>
-      </w:r>
-      <w:proofErr w:type="gramStart"/>
-      <w:r>
-        <w:rPr>
-          <w:rFonts w:ascii="Montserrat Medium" w:hAnsi="Montserrat Medium" w:cs="Times New Roman"/>
-          <w:bCs/>
-          <w:color w:val="004E76"/>
-        </w:rPr>
-        <w:t>202</w:t>
-      </w:r>
-      <w:r>
-        <w:rPr>
-          <w:rFonts w:ascii="Montserrat Medium" w:hAnsi="Montserrat Medium" w:cs="Times New Roman"/>
-          <w:bCs/>
-          <w:color w:val="004E76"/>
-        </w:rPr>
         <w:t>6</w:t>
       </w:r>
-      <w:proofErr w:type="gramEnd"/>
       <w:r>
         <w:rPr>
           <w:rFonts w:ascii="Montserrat Medium" w:hAnsi="Montserrat Medium" w:cs="Times New Roman"/>
@@ -2494,21 +2472,7 @@
         <w:rPr>
           <w:rFonts w:ascii="Montserrat Medium" w:hAnsi="Montserrat Medium"/>
         </w:rPr>
-        <w:t xml:space="preserve"> </w:t>
-      </w:r>
-      <w:proofErr w:type="gramStart"/>
-      <w:r>
-        <w:rPr>
-          <w:rFonts w:ascii="Montserrat Medium" w:hAnsi="Montserrat Medium"/>
-        </w:rPr>
-        <w:t>loader</w:t>
-      </w:r>
-      <w:proofErr w:type="gramEnd"/>
-      <w:r>
-        <w:rPr>
-          <w:rFonts w:ascii="Montserrat Medium" w:hAnsi="Montserrat Medium"/>
-        </w:rPr>
-        <w:t xml:space="preserve"> that deploys a secondary payload using DLL reflection and Living-off-the-Land binaries. The malware is designed to evade static detection through AES-encrypted embedded resources and reflective assembly loading. Persistence is achieved via registry Run keys and execution is proxied through </w:t>
+        <w:t xml:space="preserve"> loader that deploys a secondary payload using DLL reflection and Living-off-the-Land binaries. The malware is designed to evade static detection through AES-encrypted embedded resources and reflective assembly loading. Persistence is achieved via registry Run keys and execution is proxied through </w:t>
       </w:r>
       <w:proofErr w:type="spellStart"/>
       <w:r>
@@ -2916,7 +2880,7 @@
           <w:noProof/>
         </w:rPr>
         <w:drawing>
-          <wp:inline distT="0" distB="0" distL="0" distR="0" wp14:anchorId="78FA3533" wp14:editId="67C33070">
+          <wp:inline distT="0" distB="0" distL="0" distR="0" wp14:anchorId="78FA3533" wp14:editId="75FCE52E">
             <wp:extent cx="5064125" cy="8229600"/>
             <wp:effectExtent l="0" t="0" r="3175" b="0"/>
             <wp:docPr id="800585426" name="Picture 4"/>
@@ -3572,21 +3536,12 @@
         </w:rPr>
         <w:t xml:space="preserve">The XML payload is dropped in </w:t>
       </w:r>
-      <w:proofErr w:type="gramStart"/>
       <w:r>
         <w:rPr>
           <w:i/>
           <w:iCs/>
         </w:rPr>
-        <w:t>Public</w:t>
-      </w:r>
-      <w:proofErr w:type="gramEnd"/>
-      <w:r>
-        <w:rPr>
-          <w:i/>
-          <w:iCs/>
-        </w:rPr>
-        <w:t xml:space="preserve"> user folder</w:t>
+        <w:t>Public user folder</w:t>
       </w:r>
     </w:p>
     <w:p>
@@ -3709,7 +3664,6 @@
         </w:rPr>
         <w:t>Filename</w:t>
       </w:r>
-      <w:proofErr w:type="gramStart"/>
       <w:r>
         <w:rPr>
           <w:rFonts w:ascii="Montserrat Medium" w:hAnsi="Montserrat Medium"/>
@@ -3729,7 +3683,6 @@
       <w:r>
         <w:t>Malware.cryptlib64.dll</w:t>
       </w:r>
-      <w:proofErr w:type="gramEnd"/>
     </w:p>
     <w:p>
       <w:pPr>
@@ -3751,7 +3704,6 @@
         </w:rPr>
         <w:t>File size</w:t>
       </w:r>
-      <w:proofErr w:type="gramStart"/>
       <w:r>
         <w:rPr>
           <w:rFonts w:ascii="Montserrat Medium" w:hAnsi="Montserrat Medium"/>
@@ -3769,11 +3721,7 @@
         <w:t xml:space="preserve">  </w:t>
       </w:r>
       <w:r>
-        <w:t>29184</w:t>
-      </w:r>
-      <w:proofErr w:type="gramEnd"/>
-      <w:r>
-        <w:t xml:space="preserve"> bytes</w:t>
+        <w:t>29184 bytes</w:t>
       </w:r>
     </w:p>
     <w:p>
@@ -3794,16 +3742,7 @@
           <w:b/>
           <w:bCs/>
         </w:rPr>
-        <w:t>Entropy</w:t>
-      </w:r>
-      <w:proofErr w:type="gramStart"/>
-      <w:r>
-        <w:rPr>
-          <w:rFonts w:ascii="Montserrat Medium" w:hAnsi="Montserrat Medium"/>
-          <w:b/>
-          <w:bCs/>
-        </w:rPr>
-        <w:t>:</w:t>
+        <w:t>Entropy:</w:t>
       </w:r>
       <w:r>
         <w:rPr>
@@ -3814,7 +3753,6 @@
       <w:r>
         <w:t>4.178</w:t>
       </w:r>
-      <w:proofErr w:type="gramEnd"/>
     </w:p>
     <w:p>
       <w:pPr>
@@ -3836,7 +3774,6 @@
         </w:rPr>
         <w:t>File type</w:t>
       </w:r>
-      <w:proofErr w:type="gramStart"/>
       <w:r>
         <w:rPr>
           <w:rFonts w:ascii="Montserrat Medium" w:hAnsi="Montserrat Medium"/>
@@ -3858,11 +3795,7 @@
         <w:t xml:space="preserve"> </w:t>
       </w:r>
       <w:r>
-        <w:t>dynamic</w:t>
-      </w:r>
-      <w:proofErr w:type="gramEnd"/>
-      <w:r>
-        <w:t>-link-library, 64-bit, console</w:t>
+        <w:t>dynamic-link-library, 64-bit, console</w:t>
       </w:r>
     </w:p>
     <w:p>
@@ -3885,7 +3818,6 @@
         </w:rPr>
         <w:t>Architecture</w:t>
       </w:r>
-      <w:proofErr w:type="gramStart"/>
       <w:r>
         <w:rPr>
           <w:rFonts w:ascii="Montserrat Medium" w:hAnsi="Montserrat Medium"/>
@@ -3911,7 +3843,6 @@
       <w:r>
         <w:t>x64</w:t>
       </w:r>
-      <w:proofErr w:type="gramEnd"/>
     </w:p>
     <w:p>
       <w:pPr>
@@ -3933,7 +3864,6 @@
         </w:rPr>
         <w:t>Compilation timestamp</w:t>
       </w:r>
-      <w:proofErr w:type="gramStart"/>
       <w:r>
         <w:rPr>
           <w:rFonts w:ascii="Montserrat Medium" w:hAnsi="Montserrat Medium"/>
@@ -3951,11 +3881,7 @@
         <w:t xml:space="preserve">  </w:t>
       </w:r>
       <w:r>
-        <w:t>Sun</w:t>
-      </w:r>
-      <w:proofErr w:type="gramEnd"/>
-      <w:r>
-        <w:t xml:space="preserve"> Oct 10 18:14:49 2021 (UTC)</w:t>
+        <w:t>Sun Oct 10 18:14:49 2021 (UTC)</w:t>
       </w:r>
     </w:p>
     <w:p>
@@ -3978,7 +3904,6 @@
         </w:rPr>
         <w:t>Digital signature</w:t>
       </w:r>
-      <w:proofErr w:type="gramStart"/>
       <w:r>
         <w:rPr>
           <w:rFonts w:ascii="Montserrat Medium" w:hAnsi="Montserrat Medium"/>
@@ -4004,7 +3929,6 @@
       <w:r>
         <w:t>None</w:t>
       </w:r>
-      <w:proofErr w:type="gramEnd"/>
     </w:p>
     <w:p>
       <w:pPr>
@@ -4024,16 +3948,7 @@
           <w:b/>
           <w:bCs/>
         </w:rPr>
-        <w:t>Suspicious sections</w:t>
-      </w:r>
-      <w:proofErr w:type="gramStart"/>
-      <w:r>
-        <w:rPr>
-          <w:rFonts w:ascii="Montserrat Medium" w:hAnsi="Montserrat Medium"/>
-          <w:b/>
-          <w:bCs/>
-        </w:rPr>
-        <w:t>:</w:t>
+        <w:t>Suspicious sections:</w:t>
       </w:r>
       <w:r>
         <w:rPr>
@@ -4054,7 +3969,6 @@
         <w:t>.</w:t>
       </w:r>
       <w:proofErr w:type="spellStart"/>
-      <w:proofErr w:type="gramEnd"/>
       <w:r>
         <w:t>sdata</w:t>
       </w:r>
@@ -4080,7 +3994,6 @@
         </w:rPr>
         <w:t>Embedded resources</w:t>
       </w:r>
-      <w:proofErr w:type="gramStart"/>
       <w:r>
         <w:rPr>
           <w:rFonts w:ascii="Montserrat Medium" w:hAnsi="Montserrat Medium"/>
@@ -4104,7 +4017,6 @@
       <w:r>
         <w:t>EmbedDLL.dll</w:t>
       </w:r>
-      <w:proofErr w:type="gramEnd"/>
     </w:p>
     <w:p>
       <w:pPr>
@@ -4126,7 +4038,6 @@
         </w:rPr>
         <w:t>Indicators of packing or encryption</w:t>
       </w:r>
-      <w:proofErr w:type="gramStart"/>
       <w:r>
         <w:rPr>
           <w:rFonts w:ascii="Montserrat Medium" w:hAnsi="Montserrat Medium"/>
@@ -4148,11 +4059,7 @@
         <w:t xml:space="preserve"> </w:t>
       </w:r>
       <w:r>
-        <w:t>AES</w:t>
-      </w:r>
-      <w:proofErr w:type="gramEnd"/>
-      <w:r>
-        <w:t xml:space="preserve"> Encryption</w:t>
+        <w:t>AES Encryption</w:t>
       </w:r>
     </w:p>
     <w:p>
@@ -4259,21 +4166,12 @@
           <w:iCs/>
         </w:rPr>
       </w:pPr>
-      <w:proofErr w:type="gramStart"/>
       <w:r>
         <w:rPr>
           <w:i/>
           <w:iCs/>
         </w:rPr>
-        <w:t>Figure :</w:t>
-      </w:r>
-      <w:proofErr w:type="gramEnd"/>
-      <w:r>
-        <w:rPr>
-          <w:i/>
-          <w:iCs/>
-        </w:rPr>
-        <w:t xml:space="preserve"> H</w:t>
+        <w:t>Figure : H</w:t>
       </w:r>
       <w:r>
         <w:rPr>
@@ -4337,21 +4235,12 @@
           <w:iCs/>
         </w:rPr>
       </w:pPr>
-      <w:proofErr w:type="gramStart"/>
       <w:r>
         <w:rPr>
           <w:i/>
           <w:iCs/>
         </w:rPr>
-        <w:t>Figure :</w:t>
-      </w:r>
-      <w:proofErr w:type="gramEnd"/>
-      <w:r>
-        <w:rPr>
-          <w:i/>
-          <w:iCs/>
-        </w:rPr>
-        <w:t xml:space="preserve"> </w:t>
+        <w:t xml:space="preserve">Figure : </w:t>
       </w:r>
       <w:r>
         <w:rPr>
@@ -4425,21 +4314,12 @@
           <w:iCs/>
         </w:rPr>
       </w:pPr>
-      <w:proofErr w:type="gramStart"/>
       <w:r>
         <w:rPr>
           <w:i/>
           <w:iCs/>
         </w:rPr>
-        <w:t>Figure :</w:t>
-      </w:r>
-      <w:proofErr w:type="gramEnd"/>
-      <w:r>
-        <w:rPr>
-          <w:i/>
-          <w:iCs/>
-        </w:rPr>
-        <w:t xml:space="preserve"> </w:t>
+        <w:t xml:space="preserve">Figure : </w:t>
       </w:r>
       <w:r>
         <w:rPr>
@@ -5084,21 +4964,12 @@
           <w:iCs/>
         </w:rPr>
       </w:pPr>
-      <w:proofErr w:type="gramStart"/>
       <w:r>
         <w:rPr>
           <w:i/>
           <w:iCs/>
         </w:rPr>
-        <w:t>Figure :</w:t>
-      </w:r>
-      <w:proofErr w:type="gramEnd"/>
-      <w:r>
-        <w:rPr>
-          <w:i/>
-          <w:iCs/>
-        </w:rPr>
-        <w:t xml:space="preserve"> </w:t>
+        <w:t xml:space="preserve">Figure : </w:t>
       </w:r>
       <w:proofErr w:type="spellStart"/>
       <w:r>
@@ -5186,21 +5057,12 @@
           <w:iCs/>
         </w:rPr>
       </w:pPr>
-      <w:proofErr w:type="gramStart"/>
       <w:r>
         <w:rPr>
           <w:i/>
           <w:iCs/>
         </w:rPr>
-        <w:t>Figure :</w:t>
-      </w:r>
-      <w:proofErr w:type="gramEnd"/>
-      <w:r>
-        <w:rPr>
-          <w:i/>
-          <w:iCs/>
-        </w:rPr>
-        <w:t xml:space="preserve"> Persistence registry key created after initial EmbedDLL.dll execution</w:t>
+        <w:t>Figure : Persistence registry key created after initial EmbedDLL.dll execution</w:t>
       </w:r>
     </w:p>
     <w:p>
@@ -5262,21 +5124,12 @@
           <w:iCs/>
         </w:rPr>
       </w:pPr>
-      <w:proofErr w:type="gramStart"/>
       <w:r>
         <w:rPr>
           <w:i/>
           <w:iCs/>
         </w:rPr>
-        <w:t>Figure :</w:t>
-      </w:r>
-      <w:proofErr w:type="gramEnd"/>
-      <w:r>
-        <w:rPr>
-          <w:i/>
-          <w:iCs/>
-        </w:rPr>
-        <w:t xml:space="preserve"> Wireshark packet capture showing HTTP call to C2 server</w:t>
+        <w:t>Figure : Wireshark packet capture showing HTTP call to C2 server</w:t>
       </w:r>
     </w:p>
     <w:p>
@@ -5338,21 +5191,12 @@
           <w:iCs/>
         </w:rPr>
       </w:pPr>
-      <w:proofErr w:type="gramStart"/>
       <w:r>
         <w:rPr>
           <w:i/>
           <w:iCs/>
         </w:rPr>
-        <w:t>Figure :</w:t>
-      </w:r>
-      <w:proofErr w:type="gramEnd"/>
-      <w:r>
-        <w:rPr>
-          <w:i/>
-          <w:iCs/>
-        </w:rPr>
-        <w:t xml:space="preserve"> Successful request on port 80</w:t>
+        <w:t>Figure : Successful request on port 80</w:t>
       </w:r>
     </w:p>
     <w:p>
@@ -5611,21 +5455,12 @@
           <w:iCs/>
         </w:rPr>
       </w:pPr>
-      <w:proofErr w:type="gramStart"/>
       <w:r>
         <w:rPr>
           <w:i/>
           <w:iCs/>
         </w:rPr>
-        <w:t>Figure :</w:t>
-      </w:r>
-      <w:proofErr w:type="gramEnd"/>
-      <w:r>
-        <w:rPr>
-          <w:i/>
-          <w:iCs/>
-        </w:rPr>
-        <w:t xml:space="preserve"> </w:t>
+        <w:t xml:space="preserve">Figure : </w:t>
       </w:r>
       <w:r>
         <w:rPr>
@@ -5710,21 +5545,12 @@
           <w:iCs/>
         </w:rPr>
       </w:pPr>
-      <w:proofErr w:type="gramStart"/>
       <w:r>
         <w:rPr>
           <w:i/>
           <w:iCs/>
         </w:rPr>
-        <w:t>Figure :</w:t>
-      </w:r>
-      <w:proofErr w:type="gramEnd"/>
-      <w:r>
-        <w:rPr>
-          <w:i/>
-          <w:iCs/>
-        </w:rPr>
-        <w:t xml:space="preserve"> </w:t>
+        <w:t xml:space="preserve">Figure : </w:t>
       </w:r>
       <w:proofErr w:type="spellStart"/>
       <w:r>
@@ -5841,24 +5667,19 @@
         <w:spacing w:after="160" w:line="259" w:lineRule="auto"/>
         <w:jc w:val="center"/>
       </w:pPr>
-      <w:proofErr w:type="gramStart"/>
-      <w:r>
-        <w:t>Figure :</w:t>
-      </w:r>
-      <w:proofErr w:type="gramEnd"/>
+      <w:r>
+        <w:t xml:space="preserve">Figure : </w:t>
+      </w:r>
+      <w:r>
+        <w:t>Exported HTML</w:t>
+      </w:r>
+      <w:r>
+        <w:t xml:space="preserve"> POST</w:t>
+      </w:r>
       <w:r>
         <w:t xml:space="preserve"> </w:t>
       </w:r>
       <w:r>
-        <w:t>Exported HTML</w:t>
-      </w:r>
-      <w:r>
-        <w:t xml:space="preserve"> POST</w:t>
-      </w:r>
-      <w:r>
-        <w:t xml:space="preserve"> </w:t>
-      </w:r>
-      <w:r>
         <w:t>file</w:t>
       </w:r>
       <w:r>
@@ -5879,15 +5700,7 @@
         <w:t xml:space="preserve">After decrypting the </w:t>
       </w:r>
       <w:r>
-        <w:t xml:space="preserve">message portion in this HTTP </w:t>
-      </w:r>
-      <w:proofErr w:type="gramStart"/>
-      <w:r>
-        <w:t>POST</w:t>
-      </w:r>
-      <w:proofErr w:type="gramEnd"/>
-      <w:r>
-        <w:t xml:space="preserve"> </w:t>
+        <w:t xml:space="preserve">message portion in this HTTP POST </w:t>
       </w:r>
       <w:r>
         <w:t>we can identify</w:t>
@@ -5910,28 +5723,15 @@
         <w:ind w:left="720"/>
       </w:pPr>
       <w:r>
-        <w:t xml:space="preserve">GUID </w:t>
-      </w:r>
-      <w:proofErr w:type="gramStart"/>
-      <w:r>
-        <w:t xml:space="preserve">  :</w:t>
-      </w:r>
-      <w:proofErr w:type="gramEnd"/>
-      <w:r>
-        <w:t xml:space="preserve"> 4f1113988d3b14972c77</w:t>
+        <w:t>GUID   : 4f1113988d3b14972c77</w:t>
       </w:r>
     </w:p>
     <w:p>
       <w:pPr>
         <w:ind w:left="720"/>
       </w:pPr>
-      <w:proofErr w:type="gramStart"/>
-      <w:r>
-        <w:t>Opcode :</w:t>
-      </w:r>
-      <w:proofErr w:type="gramEnd"/>
-      <w:r>
-        <w:t xml:space="preserve"> 0x154615aa</w:t>
+      <w:r>
+        <w:t>Opcode : 0x154615aa</w:t>
       </w:r>
     </w:p>
     <w:p>
@@ -5947,15 +5747,7 @@
         <w:ind w:left="720"/>
       </w:pPr>
       <w:r>
-        <w:t xml:space="preserve">Beacon ID </w:t>
-      </w:r>
-      <w:proofErr w:type="gramStart"/>
-      <w:r>
-        <w:t xml:space="preserve">  :</w:t>
-      </w:r>
-      <w:proofErr w:type="gramEnd"/>
-      <w:r>
-        <w:t xml:space="preserve"> 0x8938d318 (2302202648)</w:t>
+        <w:t>Beacon ID   : 0x8938d318 (2302202648)</w:t>
       </w:r>
     </w:p>
     <w:p>
@@ -5963,15 +5755,7 @@
         <w:ind w:left="720"/>
       </w:pPr>
       <w:r>
-        <w:t xml:space="preserve">Uptime </w:t>
-      </w:r>
-      <w:proofErr w:type="gramStart"/>
-      <w:r>
-        <w:t>low  :</w:t>
-      </w:r>
-      <w:proofErr w:type="gramEnd"/>
-      <w:r>
-        <w:t xml:space="preserve"> 0x38a4de1c (950328860)</w:t>
+        <w:t>Uptime low  : 0x38a4de1c (950328860)</w:t>
       </w:r>
     </w:p>
     <w:p>
@@ -5979,15 +5763,7 @@
         <w:ind w:left="720"/>
       </w:pPr>
       <w:r>
-        <w:t xml:space="preserve">Uptime </w:t>
-      </w:r>
-      <w:proofErr w:type="gramStart"/>
-      <w:r>
-        <w:t>high :</w:t>
-      </w:r>
-      <w:proofErr w:type="gramEnd"/>
-      <w:r>
-        <w:t xml:space="preserve"> 0xdd007378 (3707794296)</w:t>
+        <w:t>Uptime high : 0xdd007378 (3707794296)</w:t>
       </w:r>
     </w:p>
     <w:p>
@@ -5995,15 +5771,7 @@
         <w:ind w:left="720"/>
       </w:pPr>
       <w:r>
-        <w:t xml:space="preserve">Flags     </w:t>
-      </w:r>
-      <w:proofErr w:type="gramStart"/>
-      <w:r>
-        <w:t xml:space="preserve">  :</w:t>
-      </w:r>
-      <w:proofErr w:type="gramEnd"/>
-      <w:r>
-        <w:t xml:space="preserve"> 0x5d30d302 (1563480834)</w:t>
+        <w:t>Flags       : 0x5d30d302 (1563480834)</w:t>
       </w:r>
     </w:p>
     <w:p>
@@ -6011,15 +5779,7 @@
         <w:ind w:left="720"/>
       </w:pPr>
       <w:r>
-        <w:t xml:space="preserve">OS </w:t>
-      </w:r>
-      <w:proofErr w:type="gramStart"/>
-      <w:r>
-        <w:t>version  :</w:t>
-      </w:r>
-      <w:proofErr w:type="gramEnd"/>
-      <w:r>
-        <w:t xml:space="preserve"> 0x0d221e46 (220339782)</w:t>
+        <w:t>OS version  : 0x0d221e46 (220339782)</w:t>
       </w:r>
     </w:p>
     <w:p>
@@ -6027,15 +5787,7 @@
         <w:ind w:left="720"/>
       </w:pPr>
       <w:r>
-        <w:t xml:space="preserve">PID       </w:t>
-      </w:r>
-      <w:proofErr w:type="gramStart"/>
-      <w:r>
-        <w:t xml:space="preserve">  :</w:t>
-      </w:r>
-      <w:proofErr w:type="gramEnd"/>
-      <w:r>
-        <w:t xml:space="preserve"> 0x1db5043a (498402362)</w:t>
+        <w:t>PID         : 0x1db5043a (498402362)</w:t>
       </w:r>
     </w:p>
     <w:p>
@@ -6043,15 +5795,7 @@
         <w:ind w:left="720"/>
       </w:pPr>
       <w:r>
-        <w:t xml:space="preserve">PPID      </w:t>
-      </w:r>
-      <w:proofErr w:type="gramStart"/>
-      <w:r>
-        <w:t xml:space="preserve">  :</w:t>
-      </w:r>
-      <w:proofErr w:type="gramEnd"/>
-      <w:r>
-        <w:t xml:space="preserve"> 0xd584cc5d (3582250077)</w:t>
+        <w:t>PPID        : 0xd584cc5d (3582250077)</w:t>
       </w:r>
     </w:p>
     <w:p>
@@ -6059,15 +5803,7 @@
         <w:ind w:left="720"/>
       </w:pPr>
       <w:r>
-        <w:t xml:space="preserve">Arch      </w:t>
-      </w:r>
-      <w:proofErr w:type="gramStart"/>
-      <w:r>
-        <w:t xml:space="preserve">  :</w:t>
-      </w:r>
-      <w:proofErr w:type="gramEnd"/>
-      <w:r>
-        <w:t xml:space="preserve"> 0x981f4c53 (2552187987)</w:t>
+        <w:t>Arch        : 0x981f4c53 (2552187987)</w:t>
       </w:r>
     </w:p>
     <w:p>
@@ -6075,15 +5811,7 @@
         <w:ind w:left="720"/>
       </w:pPr>
       <w:r>
-        <w:t xml:space="preserve">Privilege </w:t>
-      </w:r>
-      <w:proofErr w:type="gramStart"/>
-      <w:r>
-        <w:t xml:space="preserve">  :</w:t>
-      </w:r>
-      <w:proofErr w:type="gramEnd"/>
-      <w:r>
-        <w:t xml:space="preserve"> 0x8e487bff (2387115007)</w:t>
+        <w:t>Privilege   : 0x8e487bff (2387115007)</w:t>
       </w:r>
     </w:p>
     <w:p>
@@ -6091,15 +5819,7 @@
         <w:ind w:left="720"/>
       </w:pPr>
       <w:r>
-        <w:t xml:space="preserve">Net </w:t>
-      </w:r>
-      <w:proofErr w:type="gramStart"/>
-      <w:r>
-        <w:t>status  :</w:t>
-      </w:r>
-      <w:proofErr w:type="gramEnd"/>
-      <w:r>
-        <w:t xml:space="preserve"> 0x162a26c5 (371861189)</w:t>
+        <w:t>Net status  : 0x162a26c5 (371861189)</w:t>
       </w:r>
     </w:p>
     <w:p>
@@ -6107,15 +5827,7 @@
         <w:ind w:left="720"/>
       </w:pPr>
       <w:r>
-        <w:t xml:space="preserve">Unknown 1 </w:t>
-      </w:r>
-      <w:proofErr w:type="gramStart"/>
-      <w:r>
-        <w:t xml:space="preserve">  :</w:t>
-      </w:r>
-      <w:proofErr w:type="gramEnd"/>
-      <w:r>
-        <w:t xml:space="preserve"> 0x30ca19da (818551258)</w:t>
+        <w:t>Unknown 1   : 0x30ca19da (818551258)</w:t>
       </w:r>
     </w:p>
     <w:p>
@@ -6123,15 +5835,7 @@
         <w:ind w:left="720"/>
       </w:pPr>
       <w:r>
-        <w:t xml:space="preserve">Unknown 2 </w:t>
-      </w:r>
-      <w:proofErr w:type="gramStart"/>
-      <w:r>
-        <w:t xml:space="preserve">  :</w:t>
-      </w:r>
-      <w:proofErr w:type="gramEnd"/>
-      <w:r>
-        <w:t xml:space="preserve"> 0x3c6764c9 (1013408969)</w:t>
+        <w:t>Unknown 2   : 0x3c6764c9 (1013408969)</w:t>
       </w:r>
     </w:p>
     <w:p>
@@ -6139,15 +5843,7 @@
         <w:ind w:left="720"/>
       </w:pPr>
       <w:r>
-        <w:t xml:space="preserve">Checksum  </w:t>
-      </w:r>
-      <w:proofErr w:type="gramStart"/>
-      <w:r>
-        <w:t xml:space="preserve">  :</w:t>
-      </w:r>
-      <w:proofErr w:type="gramEnd"/>
-      <w:r>
-        <w:t xml:space="preserve"> 0x00005a13 (23059)</w:t>
+        <w:t>Checksum    : 0x00005a13 (23059)</w:t>
       </w:r>
     </w:p>
     <w:p>
@@ -6431,23 +6127,13 @@
           <w:szCs w:val="24"/>
         </w:rPr>
       </w:pPr>
-      <w:proofErr w:type="gramStart"/>
       <w:r>
         <w:rPr>
           <w:i/>
           <w:iCs/>
           <w:szCs w:val="24"/>
         </w:rPr>
-        <w:t>Figure :</w:t>
-      </w:r>
-      <w:proofErr w:type="gramEnd"/>
-      <w:r>
-        <w:rPr>
-          <w:i/>
-          <w:iCs/>
-          <w:szCs w:val="24"/>
-        </w:rPr>
-        <w:t xml:space="preserve"> Hardcoded password and AES decryption of a base64 string</w:t>
+        <w:t>Figure : Hardcoded password and AES decryption of a base64 string</w:t>
       </w:r>
     </w:p>
     <w:p>
@@ -6531,23 +6217,13 @@
           <w:szCs w:val="24"/>
         </w:rPr>
       </w:pPr>
-      <w:proofErr w:type="gramStart"/>
       <w:r>
         <w:rPr>
           <w:i/>
           <w:iCs/>
           <w:szCs w:val="24"/>
         </w:rPr>
-        <w:t>Figure :</w:t>
-      </w:r>
-      <w:proofErr w:type="gramEnd"/>
-      <w:r>
-        <w:rPr>
-          <w:i/>
-          <w:iCs/>
-          <w:szCs w:val="24"/>
-        </w:rPr>
-        <w:t xml:space="preserve"> AES encryption function</w:t>
+        <w:t>Figure : AES encryption function</w:t>
       </w:r>
     </w:p>
     <w:p>
@@ -6629,23 +6305,13 @@
           <w:szCs w:val="24"/>
         </w:rPr>
       </w:pPr>
-      <w:proofErr w:type="gramStart"/>
       <w:r>
         <w:rPr>
           <w:i/>
           <w:iCs/>
           <w:szCs w:val="24"/>
         </w:rPr>
-        <w:t>Figure :</w:t>
-      </w:r>
-      <w:proofErr w:type="gramEnd"/>
-      <w:r>
-        <w:rPr>
-          <w:i/>
-          <w:iCs/>
-          <w:szCs w:val="24"/>
-        </w:rPr>
-        <w:t xml:space="preserve"> Name and location of dropped VBS script and XML file to be loaded at user logon</w:t>
+        <w:t>Figure : Name and location of dropped VBS script and XML file to be loaded at user logon</w:t>
       </w:r>
     </w:p>
     <w:p>
@@ -7240,17 +6906,8 @@
           <w:i/>
           <w:iCs/>
         </w:rPr>
-        <w:t xml:space="preserve">Fig </w:t>
-      </w:r>
-      <w:proofErr w:type="gramStart"/>
-      <w:r>
-        <w:rPr>
-          <w:i/>
-          <w:iCs/>
-        </w:rPr>
-        <w:t>4:.</w:t>
-      </w:r>
-      <w:proofErr w:type="gramEnd"/>
+        <w:t>Fig 4:.</w:t>
+      </w:r>
     </w:p>
     <w:p>
       <w:pPr>
@@ -7349,46 +7006,6 @@
         </w:rPr>
       </w:pPr>
       <w:r>
-        <w:rPr>
-          <w:noProof/>
-        </w:rPr>
-        <w:drawing>
-          <wp:inline distT="0" distB="0" distL="0" distR="0" wp14:anchorId="379E43A7" wp14:editId="4D961C02">
-            <wp:extent cx="5667375" cy="5277439"/>
-            <wp:effectExtent l="0" t="0" r="0" b="0"/>
-            <wp:docPr id="11" name="Picture 11" descr="Graphical user interface, text, application, website&#10;&#10;Description automatically generated"/>
-            <wp:cNvGraphicFramePr>
-              <a:graphicFrameLocks xmlns:a="http://schemas.openxmlformats.org/drawingml/2006/main" noChangeAspect="1"/>
-            </wp:cNvGraphicFramePr>
-            <a:graphic xmlns:a="http://schemas.openxmlformats.org/drawingml/2006/main">
-              <a:graphicData uri="http://schemas.openxmlformats.org/drawingml/2006/picture">
-                <pic:pic xmlns:pic="http://schemas.openxmlformats.org/drawingml/2006/picture">
-                  <pic:nvPicPr>
-                    <pic:cNvPr id="11" name="Picture 11" descr="Graphical user interface, text, application, website&#10;&#10;Description automatically generated"/>
-                    <pic:cNvPicPr/>
-                  </pic:nvPicPr>
-                  <pic:blipFill>
-                    <a:blip r:embed="rId36"/>
-                    <a:stretch>
-                      <a:fillRect/>
-                    </a:stretch>
-                  </pic:blipFill>
-                  <pic:spPr>
-                    <a:xfrm>
-                      <a:off x="0" y="0"/>
-                      <a:ext cx="5674182" cy="5283778"/>
-                    </a:xfrm>
-                    <a:prstGeom prst="rect">
-                      <a:avLst/>
-                    </a:prstGeom>
-                  </pic:spPr>
-                </pic:pic>
-              </a:graphicData>
-            </a:graphic>
-          </wp:inline>
-        </w:drawing>
-      </w:r>
-      <w:r>
         <w:br w:type="page"/>
       </w:r>
     </w:p>
@@ -7525,31 +7142,21 @@
         <w:spacing w:after="160" w:line="259" w:lineRule="auto"/>
       </w:pPr>
       <w:r>
-        <w:t xml:space="preserve">Presence of encrypted Base64 blobs stored </w:t>
-      </w:r>
-      <w:proofErr w:type="gramStart"/>
-      <w:r>
-        <w:t>in .</w:t>
+        <w:t>Presence of encrypted Base64 blobs stored in .</w:t>
       </w:r>
       <w:proofErr w:type="spellStart"/>
       <w:r>
         <w:t>rsrc</w:t>
       </w:r>
       <w:proofErr w:type="spellEnd"/>
-      <w:proofErr w:type="gramEnd"/>
-      <w:r>
-        <w:t xml:space="preserve"> </w:t>
-      </w:r>
-      <w:proofErr w:type="gramStart"/>
-      <w:r>
-        <w:t>/ .</w:t>
+      <w:r>
+        <w:t xml:space="preserve"> / .</w:t>
       </w:r>
       <w:proofErr w:type="spellStart"/>
       <w:r>
         <w:t>rsdata</w:t>
       </w:r>
       <w:proofErr w:type="spellEnd"/>
-      <w:proofErr w:type="gramEnd"/>
       <w:r>
         <w:t xml:space="preserve"> sections</w:t>
       </w:r>
@@ -7606,17 +7213,12 @@
         <w:t xml:space="preserve">References to </w:t>
       </w:r>
       <w:proofErr w:type="spellStart"/>
-      <w:proofErr w:type="gramStart"/>
       <w:r>
         <w:t>System.Reflection.Assembly</w:t>
       </w:r>
       <w:proofErr w:type="spellEnd"/>
       <w:r>
-        <w:t>::</w:t>
-      </w:r>
-      <w:proofErr w:type="gramEnd"/>
-      <w:r>
-        <w:t>Load</w:t>
+        <w:t>::Load</w:t>
       </w:r>
     </w:p>
     <w:p>
@@ -7810,18 +7412,8 @@
           <w:b/>
           <w:bCs/>
         </w:rPr>
-        <w:t xml:space="preserve">Living-off-the-Land </w:t>
-      </w:r>
-      <w:proofErr w:type="gramStart"/>
-      <w:r>
-        <w:rPr>
-          <w:rFonts w:ascii="Montserrat Medium" w:hAnsi="Montserrat Medium"/>
-          <w:b/>
-          <w:bCs/>
-        </w:rPr>
-        <w:t>execution</w:t>
-      </w:r>
-      <w:proofErr w:type="gramEnd"/>
+        <w:t>Living-off-the-Land execution</w:t>
+      </w:r>
     </w:p>
     <w:p>
       <w:pPr>
@@ -8201,12 +7793,10 @@
         <w:spacing w:after="160" w:line="259" w:lineRule="auto"/>
       </w:pPr>
       <w:proofErr w:type="spellStart"/>
-      <w:proofErr w:type="gramStart"/>
       <w:r>
         <w:t>System.Security.Cryptography</w:t>
       </w:r>
       <w:proofErr w:type="spellEnd"/>
-      <w:proofErr w:type="gramEnd"/>
     </w:p>
     <w:p>
       <w:pPr>
@@ -9376,9 +8966,35 @@
           <w:sz w:val="21"/>
           <w:szCs w:val="21"/>
         </w:rPr>
+        <w:t xml:space="preserve"> { </w:t>
+      </w:r>
+      <w:r>
+        <w:rPr>
+          <w:rFonts w:ascii="Consolas" w:eastAsia="Times New Roman" w:hAnsi="Consolas" w:cs="Times New Roman"/>
+          <w:color w:val="CE9178"/>
+          <w:sz w:val="21"/>
+          <w:szCs w:val="21"/>
+        </w:rPr>
+        <w:t>01</w:t>
+      </w:r>
+      <w:r>
+        <w:rPr>
+          <w:rFonts w:ascii="Consolas" w:eastAsia="Times New Roman" w:hAnsi="Consolas" w:cs="Times New Roman"/>
+          <w:color w:val="CCCCCC"/>
+          <w:sz w:val="21"/>
+          <w:szCs w:val="21"/>
+        </w:rPr>
         <w:t xml:space="preserve"> </w:t>
       </w:r>
-      <w:proofErr w:type="gramStart"/>
+      <w:r>
+        <w:rPr>
+          <w:rFonts w:ascii="Consolas" w:eastAsia="Times New Roman" w:hAnsi="Consolas" w:cs="Times New Roman"/>
+          <w:color w:val="CE9178"/>
+          <w:sz w:val="21"/>
+          <w:szCs w:val="21"/>
+        </w:rPr>
+        <w:t>02</w:t>
+      </w:r>
       <w:r>
         <w:rPr>
           <w:rFonts w:ascii="Consolas" w:eastAsia="Times New Roman" w:hAnsi="Consolas" w:cs="Times New Roman"/>
@@ -9386,7 +9002,7 @@
           <w:sz w:val="21"/>
           <w:szCs w:val="21"/>
         </w:rPr>
-        <w:t xml:space="preserve">{ </w:t>
+        <w:t xml:space="preserve"> </w:t>
       </w:r>
       <w:r>
         <w:rPr>
@@ -9395,9 +9011,8 @@
           <w:sz w:val="21"/>
           <w:szCs w:val="21"/>
         </w:rPr>
-        <w:t>01</w:t>
-      </w:r>
-      <w:proofErr w:type="gramEnd"/>
+        <w:t>03</w:t>
+      </w:r>
       <w:r>
         <w:rPr>
           <w:rFonts w:ascii="Consolas" w:eastAsia="Times New Roman" w:hAnsi="Consolas" w:cs="Times New Roman"/>
@@ -9414,7 +9029,7 @@
           <w:sz w:val="21"/>
           <w:szCs w:val="21"/>
         </w:rPr>
-        <w:t>02</w:t>
+        <w:t>04</w:t>
       </w:r>
       <w:r>
         <w:rPr>
@@ -9432,7 +9047,7 @@
           <w:sz w:val="21"/>
           <w:szCs w:val="21"/>
         </w:rPr>
-        <w:t>03</w:t>
+        <w:t>05</w:t>
       </w:r>
       <w:r>
         <w:rPr>
@@ -9450,7 +9065,7 @@
           <w:sz w:val="21"/>
           <w:szCs w:val="21"/>
         </w:rPr>
-        <w:t>04</w:t>
+        <w:t>06</w:t>
       </w:r>
       <w:r>
         <w:rPr>
@@ -9468,7 +9083,7 @@
           <w:sz w:val="21"/>
           <w:szCs w:val="21"/>
         </w:rPr>
-        <w:t>05</w:t>
+        <w:t>07</w:t>
       </w:r>
       <w:r>
         <w:rPr>
@@ -9486,7 +9101,7 @@
           <w:sz w:val="21"/>
           <w:szCs w:val="21"/>
         </w:rPr>
-        <w:t>06</w:t>
+        <w:t>08</w:t>
       </w:r>
       <w:r>
         <w:rPr>
@@ -9495,46 +9110,8 @@
           <w:sz w:val="21"/>
           <w:szCs w:val="21"/>
         </w:rPr>
-        <w:t xml:space="preserve"> </w:t>
-      </w:r>
-      <w:r>
-        <w:rPr>
-          <w:rFonts w:ascii="Consolas" w:eastAsia="Times New Roman" w:hAnsi="Consolas" w:cs="Times New Roman"/>
-          <w:color w:val="CE9178"/>
-          <w:sz w:val="21"/>
-          <w:szCs w:val="21"/>
-        </w:rPr>
-        <w:t>07</w:t>
-      </w:r>
-      <w:r>
-        <w:rPr>
-          <w:rFonts w:ascii="Consolas" w:eastAsia="Times New Roman" w:hAnsi="Consolas" w:cs="Times New Roman"/>
-          <w:color w:val="CCCCCC"/>
-          <w:sz w:val="21"/>
-          <w:szCs w:val="21"/>
-        </w:rPr>
-        <w:t xml:space="preserve"> </w:t>
-      </w:r>
-      <w:proofErr w:type="gramStart"/>
-      <w:r>
-        <w:rPr>
-          <w:rFonts w:ascii="Consolas" w:eastAsia="Times New Roman" w:hAnsi="Consolas" w:cs="Times New Roman"/>
-          <w:color w:val="CE9178"/>
-          <w:sz w:val="21"/>
-          <w:szCs w:val="21"/>
-        </w:rPr>
-        <w:t>08</w:t>
-      </w:r>
-      <w:r>
-        <w:rPr>
-          <w:rFonts w:ascii="Consolas" w:eastAsia="Times New Roman" w:hAnsi="Consolas" w:cs="Times New Roman"/>
-          <w:color w:val="CCCCCC"/>
-          <w:sz w:val="21"/>
-          <w:szCs w:val="21"/>
-        </w:rPr>
         <w:t xml:space="preserve"> }</w:t>
       </w:r>
-      <w:proofErr w:type="gramEnd"/>
     </w:p>
     <w:p>
       <w:pPr>
@@ -10101,7 +9678,6 @@
         </w:rPr>
         <w:t>\"</w:t>
       </w:r>
-      <w:proofErr w:type="gramStart"/>
       <w:r>
         <w:rPr>
           <w:rFonts w:ascii="Consolas" w:eastAsia="Times New Roman" w:hAnsi="Consolas" w:cs="Times New Roman"/>
@@ -10120,7 +9696,6 @@
         </w:rPr>
         <w:t>\"</w:t>
       </w:r>
-      <w:proofErr w:type="gramEnd"/>
       <w:r>
         <w:rPr>
           <w:rFonts w:ascii="Consolas" w:eastAsia="Times New Roman" w:hAnsi="Consolas" w:cs="Times New Roman"/>
@@ -10214,7 +9789,6 @@
         </w:rPr>
         <w:t>\"</w:t>
       </w:r>
-      <w:proofErr w:type="gramStart"/>
       <w:r>
         <w:rPr>
           <w:rFonts w:ascii="Consolas" w:eastAsia="Times New Roman" w:hAnsi="Consolas" w:cs="Times New Roman"/>
@@ -10233,7 +9807,6 @@
         </w:rPr>
         <w:t>\"</w:t>
       </w:r>
-      <w:proofErr w:type="gramEnd"/>
       <w:r>
         <w:rPr>
           <w:rFonts w:ascii="Consolas" w:eastAsia="Times New Roman" w:hAnsi="Consolas" w:cs="Times New Roman"/>
@@ -10572,7 +10145,6 @@
         </w:rPr>
         <w:t xml:space="preserve">        </w:t>
       </w:r>
-      <w:proofErr w:type="gramStart"/>
       <w:r>
         <w:rPr>
           <w:rFonts w:ascii="Consolas" w:eastAsia="Times New Roman" w:hAnsi="Consolas" w:cs="Times New Roman"/>
@@ -10600,7 +10172,6 @@
         </w:rPr>
         <w:t>of</w:t>
       </w:r>
-      <w:proofErr w:type="gramEnd"/>
       <w:r>
         <w:rPr>
           <w:rFonts w:ascii="Consolas" w:eastAsia="Times New Roman" w:hAnsi="Consolas" w:cs="Times New Roman"/>
@@ -11014,15 +10585,7 @@
               <w:t>hxxp://</w:t>
             </w:r>
             <w:r>
-              <w:t xml:space="preserve"> </w:t>
-            </w:r>
-            <w:proofErr w:type="gramStart"/>
-            <w:r>
-              <w:t>srv.masterchiefsgruntemporium</w:t>
-            </w:r>
-            <w:proofErr w:type="gramEnd"/>
-            <w:r>
-              <w:t>.local</w:t>
+              <w:t xml:space="preserve"> srv.masterchiefsgruntemporium.local</w:t>
             </w:r>
           </w:p>
         </w:tc>

</xml_diff>

<commit_message>
Defanged C2 URLs in DOCX file
</commit_message>
<xml_diff>
--- a/EmbedDLL_C2_Dropper-Loader_FINAL.docx
+++ b/EmbedDLL_C2_Dropper-Loader_FINAL.docx
@@ -166,8 +166,9 @@
           <w:sz w:val="44"/>
           <w:szCs w:val="44"/>
         </w:rPr>
-        <w:t>C2</w:t>
-      </w:r>
+        <w:t>C</w:t>
+      </w:r>
+      <w:proofErr w:type="gramStart"/>
       <w:r>
         <w:rPr>
           <w:rFonts w:ascii="Montserrat Medium" w:hAnsi="Montserrat Medium" w:cs="Times New Roman"/>
@@ -176,7 +177,7 @@
           <w:sz w:val="44"/>
           <w:szCs w:val="44"/>
         </w:rPr>
-        <w:t>.</w:t>
+        <w:t>2</w:t>
       </w:r>
       <w:r>
         <w:rPr>
@@ -186,7 +187,7 @@
           <w:sz w:val="44"/>
           <w:szCs w:val="44"/>
         </w:rPr>
-        <w:t>Bootstrap</w:t>
+        <w:t>.</w:t>
       </w:r>
       <w:r>
         <w:rPr>
@@ -196,7 +197,7 @@
           <w:sz w:val="44"/>
           <w:szCs w:val="44"/>
         </w:rPr>
-        <w:t>.</w:t>
+        <w:t>Bootstrap</w:t>
       </w:r>
       <w:r>
         <w:rPr>
@@ -206,7 +207,7 @@
           <w:sz w:val="44"/>
           <w:szCs w:val="44"/>
         </w:rPr>
-        <w:t>Dropper</w:t>
+        <w:t>.</w:t>
       </w:r>
       <w:r>
         <w:rPr>
@@ -216,8 +217,9 @@
           <w:sz w:val="44"/>
           <w:szCs w:val="44"/>
         </w:rPr>
-        <w:t>.</w:t>
-      </w:r>
+        <w:t>Dropper</w:t>
+      </w:r>
+      <w:proofErr w:type="gramEnd"/>
       <w:r>
         <w:rPr>
           <w:rFonts w:ascii="Montserrat Medium" w:hAnsi="Montserrat Medium" w:cs="Times New Roman"/>
@@ -226,13 +228,9 @@
           <w:sz w:val="44"/>
           <w:szCs w:val="44"/>
         </w:rPr>
-        <w:t>Loader</w:t>
-      </w:r>
-    </w:p>
-    <w:p>
-      <w:pPr>
-        <w:spacing w:after="160" w:line="259" w:lineRule="auto"/>
-        <w:jc w:val="center"/>
+        <w:t>.</w:t>
+      </w:r>
+      <w:r>
         <w:rPr>
           <w:rFonts w:ascii="Montserrat Medium" w:hAnsi="Montserrat Medium" w:cs="Times New Roman"/>
           <w:bCs/>
@@ -240,7 +238,8 @@
           <w:sz w:val="44"/>
           <w:szCs w:val="44"/>
         </w:rPr>
-      </w:pPr>
+        <w:t>Loader</w:t>
+      </w:r>
     </w:p>
     <w:p>
       <w:pPr>
@@ -250,6 +249,8 @@
           <w:rFonts w:ascii="Montserrat Medium" w:hAnsi="Montserrat Medium" w:cs="Times New Roman"/>
           <w:bCs/>
           <w:color w:val="004E76"/>
+          <w:sz w:val="44"/>
+          <w:szCs w:val="44"/>
         </w:rPr>
       </w:pPr>
     </w:p>
@@ -263,21 +264,24 @@
           <w:color w:val="004E76"/>
         </w:rPr>
       </w:pPr>
-      <w:r>
+    </w:p>
+    <w:p>
+      <w:pPr>
+        <w:spacing w:after="160" w:line="259" w:lineRule="auto"/>
+        <w:jc w:val="center"/>
         <w:rPr>
           <w:rFonts w:ascii="Montserrat Medium" w:hAnsi="Montserrat Medium" w:cs="Times New Roman"/>
           <w:bCs/>
           <w:color w:val="004E76"/>
         </w:rPr>
-        <w:t>January 2,</w:t>
-      </w:r>
+      </w:pPr>
       <w:r>
         <w:rPr>
           <w:rFonts w:ascii="Montserrat Medium" w:hAnsi="Montserrat Medium" w:cs="Times New Roman"/>
           <w:bCs/>
           <w:color w:val="004E76"/>
         </w:rPr>
-        <w:t xml:space="preserve"> 202</w:t>
+        <w:t>January 2,</w:t>
       </w:r>
       <w:r>
         <w:rPr>
@@ -285,8 +289,26 @@
           <w:bCs/>
           <w:color w:val="004E76"/>
         </w:rPr>
+        <w:t xml:space="preserve"> </w:t>
+      </w:r>
+      <w:proofErr w:type="gramStart"/>
+      <w:r>
+        <w:rPr>
+          <w:rFonts w:ascii="Montserrat Medium" w:hAnsi="Montserrat Medium" w:cs="Times New Roman"/>
+          <w:bCs/>
+          <w:color w:val="004E76"/>
+        </w:rPr>
+        <w:t>202</w:t>
+      </w:r>
+      <w:r>
+        <w:rPr>
+          <w:rFonts w:ascii="Montserrat Medium" w:hAnsi="Montserrat Medium" w:cs="Times New Roman"/>
+          <w:bCs/>
+          <w:color w:val="004E76"/>
+        </w:rPr>
         <w:t>6</w:t>
       </w:r>
+      <w:proofErr w:type="gramEnd"/>
       <w:r>
         <w:rPr>
           <w:rFonts w:ascii="Montserrat Medium" w:hAnsi="Montserrat Medium" w:cs="Times New Roman"/>
@@ -3250,7 +3272,21 @@
         <w:rPr>
           <w:rFonts w:ascii="Montserrat Medium" w:hAnsi="Montserrat Medium"/>
         </w:rPr>
-        <w:t xml:space="preserve"> loader that deploys a secondary payload using DLL reflection and Living-off-the-Land binaries. The malware is designed to evade static detection through AES-encrypted embedded resources and reflective assembly loading. Persistence is achieved via registry Run keys and execution is proxied through MSBuild.</w:t>
+        <w:t xml:space="preserve"> </w:t>
+      </w:r>
+      <w:proofErr w:type="gramStart"/>
+      <w:r>
+        <w:rPr>
+          <w:rFonts w:ascii="Montserrat Medium" w:hAnsi="Montserrat Medium"/>
+        </w:rPr>
+        <w:t>loader</w:t>
+      </w:r>
+      <w:proofErr w:type="gramEnd"/>
+      <w:r>
+        <w:rPr>
+          <w:rFonts w:ascii="Montserrat Medium" w:hAnsi="Montserrat Medium"/>
+        </w:rPr>
+        <w:t xml:space="preserve"> that deploys a secondary payload using DLL reflection and Living-off-the-Land binaries. The malware is designed to evade static detection through AES-encrypted embedded resources and reflective assembly loading. Persistence is achieved via registry Run keys and execution is proxied through MSBuild.</w:t>
       </w:r>
       <w:r>
         <w:rPr>
@@ -3487,8 +3523,17 @@
           <w:rFonts w:ascii="Montserrat Medium" w:hAnsi="Montserrat Medium"/>
           <w:szCs w:val="24"/>
         </w:rPr>
-        <w:t>To analyze the managed .NET DLL (Malware.cryptlib64.dll), a controlled execution environment was established. The DLL requires a hosting process, as it contains managed code entry points that cannot execute</w:t>
-      </w:r>
+        <w:t xml:space="preserve">To analyze the managed .NET DLL (Malware.cryptlib64.dll), a controlled execution environment was established. The DLL requires a hosting process, as it contains managed code entry points that cannot </w:t>
+      </w:r>
+      <w:proofErr w:type="gramStart"/>
+      <w:r>
+        <w:rPr>
+          <w:rFonts w:ascii="Montserrat Medium" w:hAnsi="Montserrat Medium"/>
+          <w:szCs w:val="24"/>
+        </w:rPr>
+        <w:t>execute</w:t>
+      </w:r>
+      <w:proofErr w:type="gramEnd"/>
       <w:r>
         <w:rPr>
           <w:rFonts w:ascii="Montserrat Medium" w:hAnsi="Montserrat Medium"/>
@@ -3663,7 +3708,23 @@
           <w:rFonts w:ascii="Montserrat Medium" w:hAnsi="Montserrat Medium"/>
           <w:szCs w:val="24"/>
         </w:rPr>
-        <w:t>Entry Point: Calling EmbedDLL.Program.embed() method</w:t>
+        <w:t xml:space="preserve">Entry Point: Calling </w:t>
+      </w:r>
+      <w:proofErr w:type="gramStart"/>
+      <w:r>
+        <w:rPr>
+          <w:rFonts w:ascii="Montserrat Medium" w:hAnsi="Montserrat Medium"/>
+          <w:szCs w:val="24"/>
+        </w:rPr>
+        <w:t>EmbedDLL.Program.embed</w:t>
+      </w:r>
+      <w:proofErr w:type="gramEnd"/>
+      <w:r>
+        <w:rPr>
+          <w:rFonts w:ascii="Montserrat Medium" w:hAnsi="Montserrat Medium"/>
+          <w:szCs w:val="24"/>
+        </w:rPr>
+        <w:t>() method</w:t>
       </w:r>
     </w:p>
     <w:p>
@@ -4127,7 +4188,23 @@
           <w:rFonts w:ascii="Montserrat Medium" w:hAnsi="Montserrat Medium"/>
           <w:szCs w:val="24"/>
         </w:rPr>
-        <w:t>All findings reflect the DLL's capabilities when properly loaded</w:t>
+        <w:t xml:space="preserve">All findings reflect </w:t>
+      </w:r>
+      <w:proofErr w:type="gramStart"/>
+      <w:r>
+        <w:rPr>
+          <w:rFonts w:ascii="Montserrat Medium" w:hAnsi="Montserrat Medium"/>
+          <w:szCs w:val="24"/>
+        </w:rPr>
+        <w:t>the DLL's</w:t>
+      </w:r>
+      <w:proofErr w:type="gramEnd"/>
+      <w:r>
+        <w:rPr>
+          <w:rFonts w:ascii="Montserrat Medium" w:hAnsi="Montserrat Medium"/>
+          <w:szCs w:val="24"/>
+        </w:rPr>
+        <w:t xml:space="preserve"> capabilities when properly loaded</w:t>
       </w:r>
       <w:r>
         <w:rPr>
@@ -4468,7 +4545,7 @@
           <w:noProof/>
         </w:rPr>
         <w:drawing>
-          <wp:inline distT="0" distB="0" distL="0" distR="0" wp14:anchorId="78FA3533" wp14:editId="5EEC5AB0">
+          <wp:inline distT="0" distB="0" distL="0" distR="0" wp14:anchorId="78FA3533" wp14:editId="2B45DB36">
             <wp:extent cx="5064125" cy="8229600"/>
             <wp:effectExtent l="0" t="0" r="3175" b="0"/>
             <wp:docPr id="800585426" name="Picture 4"/>
@@ -5133,12 +5210,21 @@
         </w:rPr>
         <w:t xml:space="preserve">The XML payload is dropped in </w:t>
       </w:r>
+      <w:proofErr w:type="gramStart"/>
       <w:r>
         <w:rPr>
           <w:i/>
           <w:iCs/>
         </w:rPr>
-        <w:t>Public user folder</w:t>
+        <w:t>Public</w:t>
+      </w:r>
+      <w:proofErr w:type="gramEnd"/>
+      <w:r>
+        <w:rPr>
+          <w:i/>
+          <w:iCs/>
+        </w:rPr>
+        <w:t xml:space="preserve"> user folder</w:t>
       </w:r>
     </w:p>
     <w:p>
@@ -5759,12 +5845,21 @@
           <w:iCs/>
         </w:rPr>
       </w:pPr>
+      <w:proofErr w:type="gramStart"/>
       <w:r>
         <w:rPr>
           <w:i/>
           <w:iCs/>
         </w:rPr>
-        <w:t>Figure : H</w:t>
+        <w:t>Figure :</w:t>
+      </w:r>
+      <w:proofErr w:type="gramEnd"/>
+      <w:r>
+        <w:rPr>
+          <w:i/>
+          <w:iCs/>
+        </w:rPr>
+        <w:t xml:space="preserve"> H</w:t>
       </w:r>
       <w:r>
         <w:rPr>
@@ -5828,12 +5923,21 @@
           <w:iCs/>
         </w:rPr>
       </w:pPr>
+      <w:proofErr w:type="gramStart"/>
       <w:r>
         <w:rPr>
           <w:i/>
           <w:iCs/>
         </w:rPr>
-        <w:t xml:space="preserve">Figure : </w:t>
+        <w:t>Figure :</w:t>
+      </w:r>
+      <w:proofErr w:type="gramEnd"/>
+      <w:r>
+        <w:rPr>
+          <w:i/>
+          <w:iCs/>
+        </w:rPr>
+        <w:t xml:space="preserve"> </w:t>
       </w:r>
       <w:r>
         <w:rPr>
@@ -6692,7 +6796,27 @@
           <w:color w:val="auto"/>
           <w:szCs w:val="24"/>
         </w:rPr>
-        <w:t>User-Agent: Mozilla/5.0 (Windows NT 6.1)…Chrome/41.0…</w:t>
+        <w:t xml:space="preserve">User-Agent: Mozilla/5.0 (Windows NT </w:t>
+      </w:r>
+      <w:proofErr w:type="gramStart"/>
+      <w:r>
+        <w:rPr>
+          <w:rFonts w:ascii="Montserrat Medium" w:eastAsiaTheme="majorEastAsia" w:hAnsi="Montserrat Medium" w:cstheme="majorBidi"/>
+          <w:bCs/>
+          <w:color w:val="auto"/>
+          <w:szCs w:val="24"/>
+        </w:rPr>
+        <w:t>6.1)…</w:t>
+      </w:r>
+      <w:proofErr w:type="gramEnd"/>
+      <w:r>
+        <w:rPr>
+          <w:rFonts w:ascii="Montserrat Medium" w:eastAsiaTheme="majorEastAsia" w:hAnsi="Montserrat Medium" w:cstheme="majorBidi"/>
+          <w:bCs/>
+          <w:color w:val="auto"/>
+          <w:szCs w:val="24"/>
+        </w:rPr>
+        <w:t>Chrome/41.0…</w:t>
       </w:r>
     </w:p>
     <w:p>
@@ -6761,20 +6885,19 @@
           <w:color w:val="auto"/>
           <w:szCs w:val="24"/>
         </w:rPr>
-        <w:t>{"GUID":"{0}","Type":{1},"Meta":"{2}","IV":"{3}",</w:t>
-      </w:r>
-    </w:p>
-    <w:p>
-      <w:pPr>
-        <w:spacing w:after="160" w:line="259" w:lineRule="auto"/>
-        <w:ind w:left="720"/>
+        <w:t>{"GUID"</w:t>
+      </w:r>
+      <w:proofErr w:type="gramStart"/>
+      <w:r>
         <w:rPr>
           <w:rFonts w:ascii="Montserrat Medium" w:eastAsiaTheme="majorEastAsia" w:hAnsi="Montserrat Medium" w:cstheme="majorBidi"/>
           <w:bCs/>
           <w:color w:val="auto"/>
           <w:szCs w:val="24"/>
         </w:rPr>
-      </w:pPr>
+        <w:t>:"{0}"</w:t>
+      </w:r>
+      <w:proofErr w:type="gramEnd"/>
       <w:r>
         <w:rPr>
           <w:rFonts w:ascii="Montserrat Medium" w:eastAsiaTheme="majorEastAsia" w:hAnsi="Montserrat Medium" w:cstheme="majorBidi"/>
@@ -6782,8 +6905,120 @@
           <w:color w:val="auto"/>
           <w:szCs w:val="24"/>
         </w:rPr>
-        <w:t>"EncryptedMessage":"{4}","HMAC":"{5}"}</w:t>
-      </w:r>
+        <w:t>,"Type</w:t>
+      </w:r>
+      <w:proofErr w:type="gramStart"/>
+      <w:r>
+        <w:rPr>
+          <w:rFonts w:ascii="Montserrat Medium" w:eastAsiaTheme="majorEastAsia" w:hAnsi="Montserrat Medium" w:cstheme="majorBidi"/>
+          <w:bCs/>
+          <w:color w:val="auto"/>
+          <w:szCs w:val="24"/>
+        </w:rPr>
+        <w:t>":{1},</w:t>
+      </w:r>
+      <w:proofErr w:type="gramEnd"/>
+      <w:r>
+        <w:rPr>
+          <w:rFonts w:ascii="Montserrat Medium" w:eastAsiaTheme="majorEastAsia" w:hAnsi="Montserrat Medium" w:cstheme="majorBidi"/>
+          <w:bCs/>
+          <w:color w:val="auto"/>
+          <w:szCs w:val="24"/>
+        </w:rPr>
+        <w:t>"Meta"</w:t>
+      </w:r>
+      <w:proofErr w:type="gramStart"/>
+      <w:r>
+        <w:rPr>
+          <w:rFonts w:ascii="Montserrat Medium" w:eastAsiaTheme="majorEastAsia" w:hAnsi="Montserrat Medium" w:cstheme="majorBidi"/>
+          <w:bCs/>
+          <w:color w:val="auto"/>
+          <w:szCs w:val="24"/>
+        </w:rPr>
+        <w:t>:"{2}"</w:t>
+      </w:r>
+      <w:proofErr w:type="gramEnd"/>
+      <w:r>
+        <w:rPr>
+          <w:rFonts w:ascii="Montserrat Medium" w:eastAsiaTheme="majorEastAsia" w:hAnsi="Montserrat Medium" w:cstheme="majorBidi"/>
+          <w:bCs/>
+          <w:color w:val="auto"/>
+          <w:szCs w:val="24"/>
+        </w:rPr>
+        <w:t>,"IV"</w:t>
+      </w:r>
+      <w:proofErr w:type="gramStart"/>
+      <w:r>
+        <w:rPr>
+          <w:rFonts w:ascii="Montserrat Medium" w:eastAsiaTheme="majorEastAsia" w:hAnsi="Montserrat Medium" w:cstheme="majorBidi"/>
+          <w:bCs/>
+          <w:color w:val="auto"/>
+          <w:szCs w:val="24"/>
+        </w:rPr>
+        <w:t>:"{3}"</w:t>
+      </w:r>
+      <w:proofErr w:type="gramEnd"/>
+      <w:r>
+        <w:rPr>
+          <w:rFonts w:ascii="Montserrat Medium" w:eastAsiaTheme="majorEastAsia" w:hAnsi="Montserrat Medium" w:cstheme="majorBidi"/>
+          <w:bCs/>
+          <w:color w:val="auto"/>
+          <w:szCs w:val="24"/>
+        </w:rPr>
+        <w:t>,</w:t>
+      </w:r>
+    </w:p>
+    <w:p>
+      <w:pPr>
+        <w:spacing w:after="160" w:line="259" w:lineRule="auto"/>
+        <w:ind w:left="720"/>
+        <w:rPr>
+          <w:rFonts w:ascii="Montserrat Medium" w:eastAsiaTheme="majorEastAsia" w:hAnsi="Montserrat Medium" w:cstheme="majorBidi"/>
+          <w:bCs/>
+          <w:color w:val="auto"/>
+          <w:szCs w:val="24"/>
+        </w:rPr>
+      </w:pPr>
+      <w:r>
+        <w:rPr>
+          <w:rFonts w:ascii="Montserrat Medium" w:eastAsiaTheme="majorEastAsia" w:hAnsi="Montserrat Medium" w:cstheme="majorBidi"/>
+          <w:bCs/>
+          <w:color w:val="auto"/>
+          <w:szCs w:val="24"/>
+        </w:rPr>
+        <w:t>"EncryptedMessage"</w:t>
+      </w:r>
+      <w:proofErr w:type="gramStart"/>
+      <w:r>
+        <w:rPr>
+          <w:rFonts w:ascii="Montserrat Medium" w:eastAsiaTheme="majorEastAsia" w:hAnsi="Montserrat Medium" w:cstheme="majorBidi"/>
+          <w:bCs/>
+          <w:color w:val="auto"/>
+          <w:szCs w:val="24"/>
+        </w:rPr>
+        <w:t>:"{4}"</w:t>
+      </w:r>
+      <w:proofErr w:type="gramEnd"/>
+      <w:r>
+        <w:rPr>
+          <w:rFonts w:ascii="Montserrat Medium" w:eastAsiaTheme="majorEastAsia" w:hAnsi="Montserrat Medium" w:cstheme="majorBidi"/>
+          <w:bCs/>
+          <w:color w:val="auto"/>
+          <w:szCs w:val="24"/>
+        </w:rPr>
+        <w:t>,"HMAC"</w:t>
+      </w:r>
+      <w:proofErr w:type="gramStart"/>
+      <w:r>
+        <w:rPr>
+          <w:rFonts w:ascii="Montserrat Medium" w:eastAsiaTheme="majorEastAsia" w:hAnsi="Montserrat Medium" w:cstheme="majorBidi"/>
+          <w:bCs/>
+          <w:color w:val="auto"/>
+          <w:szCs w:val="24"/>
+        </w:rPr>
+        <w:t>:"{5}"}</w:t>
+      </w:r>
+      <w:proofErr w:type="gramEnd"/>
     </w:p>
     <w:p>
       <w:pPr>
@@ -7177,12 +7412,21 @@
           <w:iCs/>
         </w:rPr>
       </w:pPr>
+      <w:proofErr w:type="gramStart"/>
       <w:r>
         <w:rPr>
           <w:i/>
           <w:iCs/>
         </w:rPr>
-        <w:t xml:space="preserve">Figure : ProcMon shows files </w:t>
+        <w:t>Figure :</w:t>
+      </w:r>
+      <w:proofErr w:type="gramEnd"/>
+      <w:r>
+        <w:rPr>
+          <w:i/>
+          <w:iCs/>
+        </w:rPr>
+        <w:t xml:space="preserve"> ProcMon shows files </w:t>
       </w:r>
       <w:r>
         <w:rPr>
@@ -7254,12 +7498,21 @@
           <w:iCs/>
         </w:rPr>
       </w:pPr>
+      <w:proofErr w:type="gramStart"/>
       <w:r>
         <w:rPr>
           <w:i/>
           <w:iCs/>
         </w:rPr>
-        <w:t>Figure : Persistence registry key created after initial EmbedDLL.dll execution</w:t>
+        <w:t>Figure :</w:t>
+      </w:r>
+      <w:proofErr w:type="gramEnd"/>
+      <w:r>
+        <w:rPr>
+          <w:i/>
+          <w:iCs/>
+        </w:rPr>
+        <w:t xml:space="preserve"> Persistence registry key created after initial EmbedDLL.dll execution</w:t>
       </w:r>
     </w:p>
     <w:p>
@@ -7321,12 +7574,21 @@
           <w:iCs/>
         </w:rPr>
       </w:pPr>
+      <w:proofErr w:type="gramStart"/>
       <w:r>
         <w:rPr>
           <w:i/>
           <w:iCs/>
         </w:rPr>
-        <w:t>Figure : Wireshark packet capture showing HTTP call to C2 server</w:t>
+        <w:t>Figure :</w:t>
+      </w:r>
+      <w:proofErr w:type="gramEnd"/>
+      <w:r>
+        <w:rPr>
+          <w:i/>
+          <w:iCs/>
+        </w:rPr>
+        <w:t xml:space="preserve"> Wireshark packet capture showing HTTP call to C2 server</w:t>
       </w:r>
     </w:p>
     <w:p>
@@ -7388,12 +7650,21 @@
           <w:iCs/>
         </w:rPr>
       </w:pPr>
+      <w:proofErr w:type="gramStart"/>
       <w:r>
         <w:rPr>
           <w:i/>
           <w:iCs/>
         </w:rPr>
-        <w:t>Figure : Successful request on port 80</w:t>
+        <w:t>Figure :</w:t>
+      </w:r>
+      <w:proofErr w:type="gramEnd"/>
+      <w:r>
+        <w:rPr>
+          <w:i/>
+          <w:iCs/>
+        </w:rPr>
+        <w:t xml:space="preserve"> Successful request on port 80</w:t>
       </w:r>
     </w:p>
     <w:p>
@@ -7638,12 +7909,21 @@
           <w:iCs/>
         </w:rPr>
       </w:pPr>
+      <w:proofErr w:type="gramStart"/>
       <w:r>
         <w:rPr>
           <w:i/>
           <w:iCs/>
         </w:rPr>
-        <w:t xml:space="preserve">Figure : </w:t>
+        <w:t>Figure :</w:t>
+      </w:r>
+      <w:proofErr w:type="gramEnd"/>
+      <w:r>
+        <w:rPr>
+          <w:i/>
+          <w:iCs/>
+        </w:rPr>
+        <w:t xml:space="preserve"> </w:t>
       </w:r>
       <w:r>
         <w:rPr>
@@ -7719,12 +7999,21 @@
           <w:iCs/>
         </w:rPr>
       </w:pPr>
+      <w:proofErr w:type="gramStart"/>
       <w:r>
         <w:rPr>
           <w:i/>
           <w:iCs/>
         </w:rPr>
-        <w:t xml:space="preserve">Figure : Ncat </w:t>
+        <w:t>Figure :</w:t>
+      </w:r>
+      <w:proofErr w:type="gramEnd"/>
+      <w:r>
+        <w:rPr>
+          <w:i/>
+          <w:iCs/>
+        </w:rPr>
+        <w:t xml:space="preserve"> Ncat </w:t>
       </w:r>
       <w:r>
         <w:rPr>
@@ -7825,8 +8114,13 @@
         <w:spacing w:after="160" w:line="259" w:lineRule="auto"/>
         <w:jc w:val="center"/>
       </w:pPr>
-      <w:r>
-        <w:t xml:space="preserve">Figure : </w:t>
+      <w:proofErr w:type="gramStart"/>
+      <w:r>
+        <w:t>Figure :</w:t>
+      </w:r>
+      <w:proofErr w:type="gramEnd"/>
+      <w:r>
+        <w:t xml:space="preserve"> </w:t>
       </w:r>
       <w:r>
         <w:t>Exported HTML</w:t>
@@ -7858,7 +8152,15 @@
         <w:t xml:space="preserve">After decrypting the </w:t>
       </w:r>
       <w:r>
-        <w:t xml:space="preserve">message portion in this HTTP POST </w:t>
+        <w:t xml:space="preserve">message portion in this HTTP </w:t>
+      </w:r>
+      <w:proofErr w:type="gramStart"/>
+      <w:r>
+        <w:t>POST</w:t>
+      </w:r>
+      <w:proofErr w:type="gramEnd"/>
+      <w:r>
+        <w:t xml:space="preserve"> </w:t>
       </w:r>
       <w:r>
         <w:t>we can identify</w:t>
@@ -7881,15 +8183,28 @@
         <w:ind w:left="720"/>
       </w:pPr>
       <w:r>
-        <w:t>GUID   : 4f1113988d3b14972c77</w:t>
+        <w:t xml:space="preserve">GUID </w:t>
+      </w:r>
+      <w:proofErr w:type="gramStart"/>
+      <w:r>
+        <w:t xml:space="preserve">  :</w:t>
+      </w:r>
+      <w:proofErr w:type="gramEnd"/>
+      <w:r>
+        <w:t xml:space="preserve"> 4f1113988d3b14972c77</w:t>
       </w:r>
     </w:p>
     <w:p>
       <w:pPr>
         <w:ind w:left="720"/>
       </w:pPr>
-      <w:r>
-        <w:t>Opcode : 0x154615aa</w:t>
+      <w:proofErr w:type="gramStart"/>
+      <w:r>
+        <w:t>Opcode :</w:t>
+      </w:r>
+      <w:proofErr w:type="gramEnd"/>
+      <w:r>
+        <w:t xml:space="preserve"> 0x154615aa</w:t>
       </w:r>
     </w:p>
     <w:p>
@@ -7905,7 +8220,15 @@
         <w:ind w:left="720"/>
       </w:pPr>
       <w:r>
-        <w:t>Beacon ID   : 0x8938d318 (2302202648)</w:t>
+        <w:t xml:space="preserve">Beacon ID </w:t>
+      </w:r>
+      <w:proofErr w:type="gramStart"/>
+      <w:r>
+        <w:t xml:space="preserve">  :</w:t>
+      </w:r>
+      <w:proofErr w:type="gramEnd"/>
+      <w:r>
+        <w:t xml:space="preserve"> 0x8938d318 (2302202648)</w:t>
       </w:r>
     </w:p>
     <w:p>
@@ -7913,7 +8236,15 @@
         <w:ind w:left="720"/>
       </w:pPr>
       <w:r>
-        <w:t>Uptime low  : 0x38a4de1c (950328860)</w:t>
+        <w:t xml:space="preserve">Uptime </w:t>
+      </w:r>
+      <w:proofErr w:type="gramStart"/>
+      <w:r>
+        <w:t>low  :</w:t>
+      </w:r>
+      <w:proofErr w:type="gramEnd"/>
+      <w:r>
+        <w:t xml:space="preserve"> 0x38a4de1c (950328860)</w:t>
       </w:r>
     </w:p>
     <w:p>
@@ -7921,7 +8252,15 @@
         <w:ind w:left="720"/>
       </w:pPr>
       <w:r>
-        <w:t>Uptime high : 0xdd007378 (3707794296)</w:t>
+        <w:t xml:space="preserve">Uptime </w:t>
+      </w:r>
+      <w:proofErr w:type="gramStart"/>
+      <w:r>
+        <w:t>high :</w:t>
+      </w:r>
+      <w:proofErr w:type="gramEnd"/>
+      <w:r>
+        <w:t xml:space="preserve"> 0xdd007378 (3707794296)</w:t>
       </w:r>
     </w:p>
     <w:p>
@@ -7929,7 +8268,15 @@
         <w:ind w:left="720"/>
       </w:pPr>
       <w:r>
-        <w:t>Flags       : 0x5d30d302 (1563480834)</w:t>
+        <w:t xml:space="preserve">Flags     </w:t>
+      </w:r>
+      <w:proofErr w:type="gramStart"/>
+      <w:r>
+        <w:t xml:space="preserve">  :</w:t>
+      </w:r>
+      <w:proofErr w:type="gramEnd"/>
+      <w:r>
+        <w:t xml:space="preserve"> 0x5d30d302 (1563480834)</w:t>
       </w:r>
     </w:p>
     <w:p>
@@ -7937,7 +8284,15 @@
         <w:ind w:left="720"/>
       </w:pPr>
       <w:r>
-        <w:t>OS version  : 0x0d221e46 (220339782)</w:t>
+        <w:t xml:space="preserve">OS </w:t>
+      </w:r>
+      <w:proofErr w:type="gramStart"/>
+      <w:r>
+        <w:t>version  :</w:t>
+      </w:r>
+      <w:proofErr w:type="gramEnd"/>
+      <w:r>
+        <w:t xml:space="preserve"> 0x0d221e46 (220339782)</w:t>
       </w:r>
     </w:p>
     <w:p>
@@ -7945,7 +8300,15 @@
         <w:ind w:left="720"/>
       </w:pPr>
       <w:r>
-        <w:t>PID         : 0x1db5043a (498402362)</w:t>
+        <w:t xml:space="preserve">PID       </w:t>
+      </w:r>
+      <w:proofErr w:type="gramStart"/>
+      <w:r>
+        <w:t xml:space="preserve">  :</w:t>
+      </w:r>
+      <w:proofErr w:type="gramEnd"/>
+      <w:r>
+        <w:t xml:space="preserve"> 0x1db5043a (498402362)</w:t>
       </w:r>
     </w:p>
     <w:p>
@@ -7953,7 +8316,15 @@
         <w:ind w:left="720"/>
       </w:pPr>
       <w:r>
-        <w:t>PPID        : 0xd584cc5d (3582250077)</w:t>
+        <w:t xml:space="preserve">PPID      </w:t>
+      </w:r>
+      <w:proofErr w:type="gramStart"/>
+      <w:r>
+        <w:t xml:space="preserve">  :</w:t>
+      </w:r>
+      <w:proofErr w:type="gramEnd"/>
+      <w:r>
+        <w:t xml:space="preserve"> 0xd584cc5d (3582250077)</w:t>
       </w:r>
     </w:p>
     <w:p>
@@ -7961,7 +8332,15 @@
         <w:ind w:left="720"/>
       </w:pPr>
       <w:r>
-        <w:t>Arch        : 0x981f4c53 (2552187987)</w:t>
+        <w:t xml:space="preserve">Arch      </w:t>
+      </w:r>
+      <w:proofErr w:type="gramStart"/>
+      <w:r>
+        <w:t xml:space="preserve">  :</w:t>
+      </w:r>
+      <w:proofErr w:type="gramEnd"/>
+      <w:r>
+        <w:t xml:space="preserve"> 0x981f4c53 (2552187987)</w:t>
       </w:r>
     </w:p>
     <w:p>
@@ -7969,7 +8348,15 @@
         <w:ind w:left="720"/>
       </w:pPr>
       <w:r>
-        <w:t>Privilege   : 0x8e487bff (2387115007)</w:t>
+        <w:t xml:space="preserve">Privilege </w:t>
+      </w:r>
+      <w:proofErr w:type="gramStart"/>
+      <w:r>
+        <w:t xml:space="preserve">  :</w:t>
+      </w:r>
+      <w:proofErr w:type="gramEnd"/>
+      <w:r>
+        <w:t xml:space="preserve"> 0x8e487bff (2387115007)</w:t>
       </w:r>
     </w:p>
     <w:p>
@@ -7977,7 +8364,15 @@
         <w:ind w:left="720"/>
       </w:pPr>
       <w:r>
-        <w:t>Net status  : 0x162a26c5 (371861189)</w:t>
+        <w:t xml:space="preserve">Net </w:t>
+      </w:r>
+      <w:proofErr w:type="gramStart"/>
+      <w:r>
+        <w:t>status  :</w:t>
+      </w:r>
+      <w:proofErr w:type="gramEnd"/>
+      <w:r>
+        <w:t xml:space="preserve"> 0x162a26c5 (371861189)</w:t>
       </w:r>
     </w:p>
     <w:p>
@@ -7985,7 +8380,15 @@
         <w:ind w:left="720"/>
       </w:pPr>
       <w:r>
-        <w:t>Unknown 1   : 0x30ca19da (818551258)</w:t>
+        <w:t xml:space="preserve">Unknown 1 </w:t>
+      </w:r>
+      <w:proofErr w:type="gramStart"/>
+      <w:r>
+        <w:t xml:space="preserve">  :</w:t>
+      </w:r>
+      <w:proofErr w:type="gramEnd"/>
+      <w:r>
+        <w:t xml:space="preserve"> 0x30ca19da (818551258)</w:t>
       </w:r>
     </w:p>
     <w:p>
@@ -7993,7 +8396,15 @@
         <w:ind w:left="720"/>
       </w:pPr>
       <w:r>
-        <w:t>Unknown 2   : 0x3c6764c9 (1013408969)</w:t>
+        <w:t xml:space="preserve">Unknown 2 </w:t>
+      </w:r>
+      <w:proofErr w:type="gramStart"/>
+      <w:r>
+        <w:t xml:space="preserve">  :</w:t>
+      </w:r>
+      <w:proofErr w:type="gramEnd"/>
+      <w:r>
+        <w:t xml:space="preserve"> 0x3c6764c9 (1013408969)</w:t>
       </w:r>
     </w:p>
     <w:p>
@@ -8001,7 +8412,15 @@
         <w:ind w:left="720"/>
       </w:pPr>
       <w:r>
-        <w:t>Checksum    : 0x00005a13 (23059)</w:t>
+        <w:t xml:space="preserve">Checksum  </w:t>
+      </w:r>
+      <w:proofErr w:type="gramStart"/>
+      <w:r>
+        <w:t xml:space="preserve">  :</w:t>
+      </w:r>
+      <w:proofErr w:type="gramEnd"/>
+      <w:r>
+        <w:t xml:space="preserve"> 0x00005a13 (23059)</w:t>
       </w:r>
     </w:p>
     <w:p>
@@ -8428,13 +8847,23 @@
           <w:szCs w:val="24"/>
         </w:rPr>
       </w:pPr>
+      <w:proofErr w:type="gramStart"/>
       <w:r>
         <w:rPr>
           <w:i/>
           <w:iCs/>
           <w:szCs w:val="24"/>
         </w:rPr>
-        <w:t>Figure : Hardcoded password and AES decryption of a base64 string</w:t>
+        <w:t>Figure :</w:t>
+      </w:r>
+      <w:proofErr w:type="gramEnd"/>
+      <w:r>
+        <w:rPr>
+          <w:i/>
+          <w:iCs/>
+          <w:szCs w:val="24"/>
+        </w:rPr>
+        <w:t xml:space="preserve"> Hardcoded password and AES decryption of a base64 string</w:t>
       </w:r>
     </w:p>
     <w:p>
@@ -8518,13 +8947,23 @@
           <w:szCs w:val="24"/>
         </w:rPr>
       </w:pPr>
+      <w:proofErr w:type="gramStart"/>
       <w:r>
         <w:rPr>
           <w:i/>
           <w:iCs/>
           <w:szCs w:val="24"/>
         </w:rPr>
-        <w:t>Figure : AES encryption function</w:t>
+        <w:t>Figure :</w:t>
+      </w:r>
+      <w:proofErr w:type="gramEnd"/>
+      <w:r>
+        <w:rPr>
+          <w:i/>
+          <w:iCs/>
+          <w:szCs w:val="24"/>
+        </w:rPr>
+        <w:t xml:space="preserve"> AES encryption function</w:t>
       </w:r>
     </w:p>
     <w:p>
@@ -8606,13 +9045,23 @@
           <w:szCs w:val="24"/>
         </w:rPr>
       </w:pPr>
+      <w:proofErr w:type="gramStart"/>
       <w:r>
         <w:rPr>
           <w:i/>
           <w:iCs/>
           <w:szCs w:val="24"/>
         </w:rPr>
-        <w:t>Figure : Name and location of dropped VBS script and XML file to be loaded at user logon</w:t>
+        <w:t>Figure :</w:t>
+      </w:r>
+      <w:proofErr w:type="gramEnd"/>
+      <w:r>
+        <w:rPr>
+          <w:i/>
+          <w:iCs/>
+          <w:szCs w:val="24"/>
+        </w:rPr>
+        <w:t xml:space="preserve"> Name and location of dropped VBS script and XML file to be loaded at user logon</w:t>
       </w:r>
     </w:p>
     <w:p>
@@ -9886,8 +10335,17 @@
           <w:i/>
           <w:iCs/>
         </w:rPr>
-        <w:t>Fig 4:.</w:t>
-      </w:r>
+        <w:t xml:space="preserve">Fig </w:t>
+      </w:r>
+      <w:proofErr w:type="gramStart"/>
+      <w:r>
+        <w:rPr>
+          <w:i/>
+          <w:iCs/>
+        </w:rPr>
+        <w:t>4:.</w:t>
+      </w:r>
+      <w:proofErr w:type="gramEnd"/>
     </w:p>
     <w:p>
       <w:pPr>
@@ -10015,7 +10473,37 @@
               <w:spacing w:after="160" w:line="259" w:lineRule="auto"/>
             </w:pPr>
             <w:r>
-              <w:t>http://srv.masterchiefsgruntemporium.local:80</w:t>
+              <w:t>h</w:t>
+            </w:r>
+            <w:r>
+              <w:t>xx</w:t>
+            </w:r>
+            <w:r>
+              <w:t>p://srv</w:t>
+            </w:r>
+            <w:r>
+              <w:t>[</w:t>
+            </w:r>
+            <w:r>
+              <w:t>.</w:t>
+            </w:r>
+            <w:r>
+              <w:t>]</w:t>
+            </w:r>
+            <w:r>
+              <w:t>masterchiefsgruntemporium</w:t>
+            </w:r>
+            <w:r>
+              <w:t>[</w:t>
+            </w:r>
+            <w:r>
+              <w:t>.</w:t>
+            </w:r>
+            <w:r>
+              <w:t>]</w:t>
+            </w:r>
+            <w:r>
+              <w:t>local:80</w:t>
             </w:r>
           </w:p>
         </w:tc>
@@ -10231,7 +10719,15 @@
               <w:spacing w:after="160" w:line="259" w:lineRule="auto"/>
             </w:pPr>
             <w:r>
-              <w:t>i=a19ea23062db990386a3a478cb89d52e&amp;data={0}&amp;session=75db-99b1-25fe4e9afbe58696-320bea73</w:t>
+              <w:t>i=a19ea23062db990386a3a478cb89d52e&amp;data</w:t>
+            </w:r>
+            <w:proofErr w:type="gramStart"/>
+            <w:r>
+              <w:t>={0}&amp;</w:t>
+            </w:r>
+            <w:proofErr w:type="gramEnd"/>
+            <w:r>
+              <w:t>session=75db-99b1-25fe4e9afbe58696-320bea73</w:t>
             </w:r>
           </w:p>
         </w:tc>
@@ -10393,7 +10889,55 @@
               <w:spacing w:after="160" w:line="259" w:lineRule="auto"/>
             </w:pPr>
             <w:r>
-              <w:t>{"GUID":"{0}","Type":{1},"Meta":"{2}","IV":"{3}","EncryptedMessage":"{4}","HMAC":"{5}"}</w:t>
+              <w:t>{"GUID"</w:t>
+            </w:r>
+            <w:proofErr w:type="gramStart"/>
+            <w:r>
+              <w:t>:"{0}"</w:t>
+            </w:r>
+            <w:proofErr w:type="gramEnd"/>
+            <w:r>
+              <w:t>,"Type</w:t>
+            </w:r>
+            <w:proofErr w:type="gramStart"/>
+            <w:r>
+              <w:t>":{1},</w:t>
+            </w:r>
+            <w:proofErr w:type="gramEnd"/>
+            <w:r>
+              <w:t>"Meta"</w:t>
+            </w:r>
+            <w:proofErr w:type="gramStart"/>
+            <w:r>
+              <w:t>:"{2}"</w:t>
+            </w:r>
+            <w:proofErr w:type="gramEnd"/>
+            <w:r>
+              <w:t>,"</w:t>
+            </w:r>
+            <w:proofErr w:type="gramStart"/>
+            <w:r>
+              <w:t>IV":"{3}"</w:t>
+            </w:r>
+            <w:proofErr w:type="gramEnd"/>
+            <w:r>
+              <w:t>,"EncryptedMessage"</w:t>
+            </w:r>
+            <w:proofErr w:type="gramStart"/>
+            <w:r>
+              <w:t>:"{4}"</w:t>
+            </w:r>
+            <w:proofErr w:type="gramEnd"/>
+            <w:r>
+              <w:t>,"HMAC"</w:t>
+            </w:r>
+            <w:proofErr w:type="gramStart"/>
+            <w:r>
+              <w:t>:"{</w:t>
+            </w:r>
+            <w:proofErr w:type="gramEnd"/>
+            <w:r>
+              <w:t>5}"}</w:t>
             </w:r>
           </w:p>
         </w:tc>
@@ -10851,7 +11395,15 @@
               <w:spacing w:after="160" w:line="259" w:lineRule="auto"/>
             </w:pPr>
             <w:r>
-              <w:t>Pinned certificate hash associated with Covenant framework</w:t>
+              <w:t xml:space="preserve">Pinned certificate </w:t>
+            </w:r>
+            <w:proofErr w:type="gramStart"/>
+            <w:r>
+              <w:t>hash</w:t>
+            </w:r>
+            <w:proofErr w:type="gramEnd"/>
+            <w:r>
+              <w:t xml:space="preserve"> associated with Covenant framework</w:t>
             </w:r>
           </w:p>
         </w:tc>
@@ -11132,11 +11684,19 @@
           <w:rFonts w:ascii="Montserrat Medium" w:hAnsi="Montserrat Medium"/>
         </w:rPr>
       </w:pPr>
-      <w:r>
-        <w:rPr>
-          <w:rFonts w:ascii="Montserrat Medium" w:hAnsi="Montserrat Medium"/>
-        </w:rPr>
-        <w:t>Analysis Artifacts (NOT MALICIOUS)</w:t>
+      <w:proofErr w:type="gramStart"/>
+      <w:r>
+        <w:rPr>
+          <w:rFonts w:ascii="Montserrat Medium" w:hAnsi="Montserrat Medium"/>
+        </w:rPr>
+        <w:t>Analysis</w:t>
+      </w:r>
+      <w:proofErr w:type="gramEnd"/>
+      <w:r>
+        <w:rPr>
+          <w:rFonts w:ascii="Montserrat Medium" w:hAnsi="Montserrat Medium"/>
+        </w:rPr>
+        <w:t xml:space="preserve"> Artifacts (NOT MALICIOUS)</w:t>
       </w:r>
     </w:p>
     <w:p>
@@ -11299,7 +11859,23 @@
         <w:spacing w:after="160" w:line="259" w:lineRule="auto"/>
       </w:pPr>
       <w:r>
-        <w:t>Presence of encrypted Base64 blobs stored in .rsrc / .rsdata sections</w:t>
+        <w:t xml:space="preserve">Presence of encrypted Base64 blobs stored </w:t>
+      </w:r>
+      <w:proofErr w:type="gramStart"/>
+      <w:r>
+        <w:t>in .rsrc</w:t>
+      </w:r>
+      <w:proofErr w:type="gramEnd"/>
+      <w:r>
+        <w:t xml:space="preserve"> </w:t>
+      </w:r>
+      <w:proofErr w:type="gramStart"/>
+      <w:r>
+        <w:t>/ .rsdata</w:t>
+      </w:r>
+      <w:proofErr w:type="gramEnd"/>
+      <w:r>
+        <w:t xml:space="preserve"> sections</w:t>
       </w:r>
     </w:p>
     <w:p>
@@ -11343,7 +11919,15 @@
         <w:spacing w:after="160" w:line="259" w:lineRule="auto"/>
       </w:pPr>
       <w:r>
-        <w:t>References to System.Reflection.Assembly::Load</w:t>
+        <w:t xml:space="preserve">References to </w:t>
+      </w:r>
+      <w:proofErr w:type="gramStart"/>
+      <w:r>
+        <w:t>System.Reflection.Assembly::</w:t>
+      </w:r>
+      <w:proofErr w:type="gramEnd"/>
+      <w:r>
+        <w:t>Load</w:t>
       </w:r>
     </w:p>
     <w:p>
@@ -11521,8 +12105,18 @@
           <w:b/>
           <w:bCs/>
         </w:rPr>
-        <w:t>Living-off-the-Land execution</w:t>
-      </w:r>
+        <w:t xml:space="preserve">Living-off-the-Land </w:t>
+      </w:r>
+      <w:proofErr w:type="gramStart"/>
+      <w:r>
+        <w:rPr>
+          <w:rFonts w:ascii="Montserrat Medium" w:hAnsi="Montserrat Medium"/>
+          <w:b/>
+          <w:bCs/>
+        </w:rPr>
+        <w:t>execution</w:t>
+      </w:r>
+      <w:proofErr w:type="gramEnd"/>
     </w:p>
     <w:p>
       <w:pPr>
@@ -11885,9 +12479,11 @@
       <w:pPr>
         <w:spacing w:after="160" w:line="259" w:lineRule="auto"/>
       </w:pPr>
+      <w:proofErr w:type="gramStart"/>
       <w:r>
         <w:t>System.Security.Cryptography</w:t>
       </w:r>
+      <w:proofErr w:type="gramEnd"/>
     </w:p>
     <w:p>
       <w:pPr>
@@ -12980,7 +13576,17 @@
           <w:sz w:val="21"/>
           <w:szCs w:val="21"/>
         </w:rPr>
-        <w:t xml:space="preserve"> { </w:t>
+        <w:t xml:space="preserve"> </w:t>
+      </w:r>
+      <w:proofErr w:type="gramStart"/>
+      <w:r>
+        <w:rPr>
+          <w:rFonts w:ascii="Consolas" w:eastAsia="Times New Roman" w:hAnsi="Consolas" w:cs="Times New Roman"/>
+          <w:color w:val="CCCCCC"/>
+          <w:sz w:val="21"/>
+          <w:szCs w:val="21"/>
+        </w:rPr>
+        <w:t xml:space="preserve">{ </w:t>
       </w:r>
       <w:r>
         <w:rPr>
@@ -12991,6 +13597,7 @@
         </w:rPr>
         <w:t>01</w:t>
       </w:r>
+      <w:proofErr w:type="gramEnd"/>
       <w:r>
         <w:rPr>
           <w:rFonts w:ascii="Consolas" w:eastAsia="Times New Roman" w:hAnsi="Consolas" w:cs="Times New Roman"/>
@@ -13108,6 +13715,7 @@
         </w:rPr>
         <w:t xml:space="preserve"> </w:t>
       </w:r>
+      <w:proofErr w:type="gramStart"/>
       <w:r>
         <w:rPr>
           <w:rFonts w:ascii="Consolas" w:eastAsia="Times New Roman" w:hAnsi="Consolas" w:cs="Times New Roman"/>
@@ -13126,6 +13734,7 @@
         </w:rPr>
         <w:t xml:space="preserve"> }</w:t>
       </w:r>
+      <w:proofErr w:type="gramEnd"/>
     </w:p>
     <w:p>
       <w:pPr>
@@ -13666,6 +14275,7 @@
         </w:rPr>
         <w:t>\"</w:t>
       </w:r>
+      <w:proofErr w:type="gramStart"/>
       <w:r>
         <w:rPr>
           <w:rFonts w:ascii="Consolas" w:eastAsia="Times New Roman" w:hAnsi="Consolas" w:cs="Times New Roman"/>
@@ -13684,6 +14294,7 @@
         </w:rPr>
         <w:t>\"</w:t>
       </w:r>
+      <w:proofErr w:type="gramEnd"/>
       <w:r>
         <w:rPr>
           <w:rFonts w:ascii="Consolas" w:eastAsia="Times New Roman" w:hAnsi="Consolas" w:cs="Times New Roman"/>
@@ -13777,6 +14388,7 @@
         </w:rPr>
         <w:t>\"</w:t>
       </w:r>
+      <w:proofErr w:type="gramStart"/>
       <w:r>
         <w:rPr>
           <w:rFonts w:ascii="Consolas" w:eastAsia="Times New Roman" w:hAnsi="Consolas" w:cs="Times New Roman"/>
@@ -13795,6 +14407,7 @@
         </w:rPr>
         <w:t>\"</w:t>
       </w:r>
+      <w:proofErr w:type="gramEnd"/>
       <w:r>
         <w:rPr>
           <w:rFonts w:ascii="Consolas" w:eastAsia="Times New Roman" w:hAnsi="Consolas" w:cs="Times New Roman"/>
@@ -14113,6 +14726,7 @@
         </w:rPr>
         <w:t xml:space="preserve">        </w:t>
       </w:r>
+      <w:proofErr w:type="gramStart"/>
       <w:r>
         <w:rPr>
           <w:rFonts w:ascii="Consolas" w:eastAsia="Times New Roman" w:hAnsi="Consolas" w:cs="Times New Roman"/>
@@ -14140,6 +14754,7 @@
         </w:rPr>
         <w:t>of</w:t>
       </w:r>
+      <w:proofErr w:type="gramEnd"/>
       <w:r>
         <w:rPr>
           <w:rFonts w:ascii="Consolas" w:eastAsia="Times New Roman" w:hAnsi="Consolas" w:cs="Times New Roman"/>
@@ -14484,8 +15099,8 @@
         <w:tblLook w:val="04A0" w:firstRow="1" w:lastRow="0" w:firstColumn="1" w:lastColumn="0" w:noHBand="0" w:noVBand="1"/>
       </w:tblPr>
       <w:tblGrid>
-        <w:gridCol w:w="4866"/>
-        <w:gridCol w:w="4683"/>
+        <w:gridCol w:w="5845"/>
+        <w:gridCol w:w="3704"/>
       </w:tblGrid>
       <w:tr>
         <w:trPr>
@@ -14495,7 +15110,7 @@
         <w:tc>
           <w:tcPr>
             <w:cnfStyle w:val="001000000000" w:firstRow="0" w:lastRow="0" w:firstColumn="1" w:lastColumn="0" w:oddVBand="0" w:evenVBand="0" w:oddHBand="0" w:evenHBand="0" w:firstRowFirstColumn="0" w:firstRowLastColumn="0" w:lastRowFirstColumn="0" w:lastRowLastColumn="0"/>
-            <w:tcW w:w="4866" w:type="dxa"/>
+            <w:tcW w:w="5845" w:type="dxa"/>
           </w:tcPr>
           <w:p>
             <w:pPr>
@@ -14508,7 +15123,7 @@
         </w:tc>
         <w:tc>
           <w:tcPr>
-            <w:tcW w:w="4683" w:type="dxa"/>
+            <w:tcW w:w="3704" w:type="dxa"/>
           </w:tcPr>
           <w:p>
             <w:pPr>
@@ -14529,20 +15144,51 @@
         <w:tc>
           <w:tcPr>
             <w:cnfStyle w:val="001000000000" w:firstRow="0" w:lastRow="0" w:firstColumn="1" w:lastColumn="0" w:oddVBand="0" w:evenVBand="0" w:oddHBand="0" w:evenHBand="0" w:firstRowFirstColumn="0" w:firstRowLastColumn="0" w:lastRowFirstColumn="0" w:lastRowLastColumn="0"/>
-            <w:tcW w:w="4866" w:type="dxa"/>
+            <w:tcW w:w="5845" w:type="dxa"/>
           </w:tcPr>
           <w:p>
             <w:r>
               <w:t>hxxp://</w:t>
             </w:r>
             <w:r>
-              <w:t xml:space="preserve"> srv.masterchiefsgruntemporium.local</w:t>
+              <w:t xml:space="preserve"> </w:t>
+            </w:r>
+            <w:proofErr w:type="spellStart"/>
+            <w:r>
+              <w:t>srv</w:t>
+            </w:r>
+            <w:proofErr w:type="spellEnd"/>
+            <w:r>
+              <w:t>[</w:t>
+            </w:r>
+            <w:r>
+              <w:t>.</w:t>
+            </w:r>
+            <w:r>
+              <w:t>]</w:t>
+            </w:r>
+            <w:proofErr w:type="spellStart"/>
+            <w:r>
+              <w:t>masterchiefsgruntemporium</w:t>
+            </w:r>
+            <w:proofErr w:type="spellEnd"/>
+            <w:r>
+              <w:t>[</w:t>
+            </w:r>
+            <w:r>
+              <w:t>.</w:t>
+            </w:r>
+            <w:r>
+              <w:t>]</w:t>
+            </w:r>
+            <w:r>
+              <w:t>local</w:t>
             </w:r>
           </w:p>
         </w:tc>
         <w:tc>
           <w:tcPr>
-            <w:tcW w:w="4683" w:type="dxa"/>
+            <w:tcW w:w="3704" w:type="dxa"/>
           </w:tcPr>
           <w:p>
             <w:pPr>
@@ -14561,13 +15207,13 @@
         <w:tc>
           <w:tcPr>
             <w:cnfStyle w:val="001000000000" w:firstRow="0" w:lastRow="0" w:firstColumn="1" w:lastColumn="0" w:oddVBand="0" w:evenVBand="0" w:oddHBand="0" w:evenHBand="0" w:firstRowFirstColumn="0" w:firstRowLastColumn="0" w:lastRowFirstColumn="0" w:lastRowLastColumn="0"/>
-            <w:tcW w:w="4866" w:type="dxa"/>
+            <w:tcW w:w="5845" w:type="dxa"/>
           </w:tcPr>
           <w:p/>
         </w:tc>
         <w:tc>
           <w:tcPr>
-            <w:tcW w:w="4683" w:type="dxa"/>
+            <w:tcW w:w="3704" w:type="dxa"/>
           </w:tcPr>
           <w:p>
             <w:pPr>
@@ -14584,13 +15230,13 @@
         <w:tc>
           <w:tcPr>
             <w:cnfStyle w:val="001000000000" w:firstRow="0" w:lastRow="0" w:firstColumn="1" w:lastColumn="0" w:oddVBand="0" w:evenVBand="0" w:oddHBand="0" w:evenHBand="0" w:firstRowFirstColumn="0" w:firstRowLastColumn="0" w:lastRowFirstColumn="0" w:lastRowLastColumn="0"/>
-            <w:tcW w:w="4866" w:type="dxa"/>
+            <w:tcW w:w="5845" w:type="dxa"/>
           </w:tcPr>
           <w:p/>
         </w:tc>
         <w:tc>
           <w:tcPr>
-            <w:tcW w:w="4683" w:type="dxa"/>
+            <w:tcW w:w="3704" w:type="dxa"/>
           </w:tcPr>
           <w:p>
             <w:pPr>

</xml_diff>

<commit_message>
More URLs to defang
</commit_message>
<xml_diff>
--- a/EmbedDLL_C2_Dropper-Loader_FINAL.docx
+++ b/EmbedDLL_C2_Dropper-Loader_FINAL.docx
@@ -4545,7 +4545,7 @@
           <w:noProof/>
         </w:rPr>
         <w:drawing>
-          <wp:inline distT="0" distB="0" distL="0" distR="0" wp14:anchorId="78FA3533" wp14:editId="2B45DB36">
+          <wp:inline distT="0" distB="0" distL="0" distR="0" wp14:anchorId="78FA3533" wp14:editId="30362A89">
             <wp:extent cx="5064125" cy="8229600"/>
             <wp:effectExtent l="0" t="0" r="3175" b="0"/>
             <wp:docPr id="800585426" name="Picture 4"/>
@@ -6714,7 +6714,97 @@
           <w:szCs w:val="24"/>
         </w:rPr>
         <w:br/>
-        <w:t>http://srv.masterchiefsgruntemporium.local:80</w:t>
+        <w:t>h</w:t>
+      </w:r>
+      <w:r>
+        <w:rPr>
+          <w:rFonts w:ascii="Montserrat Medium" w:eastAsiaTheme="majorEastAsia" w:hAnsi="Montserrat Medium" w:cstheme="majorBidi"/>
+          <w:bCs/>
+          <w:color w:val="auto"/>
+          <w:szCs w:val="24"/>
+        </w:rPr>
+        <w:t>xx</w:t>
+      </w:r>
+      <w:r>
+        <w:rPr>
+          <w:rFonts w:ascii="Montserrat Medium" w:eastAsiaTheme="majorEastAsia" w:hAnsi="Montserrat Medium" w:cstheme="majorBidi"/>
+          <w:bCs/>
+          <w:color w:val="auto"/>
+          <w:szCs w:val="24"/>
+        </w:rPr>
+        <w:t>p://srv</w:t>
+      </w:r>
+      <w:r>
+        <w:rPr>
+          <w:rFonts w:ascii="Montserrat Medium" w:eastAsiaTheme="majorEastAsia" w:hAnsi="Montserrat Medium" w:cstheme="majorBidi"/>
+          <w:bCs/>
+          <w:color w:val="auto"/>
+          <w:szCs w:val="24"/>
+        </w:rPr>
+        <w:t>[</w:t>
+      </w:r>
+      <w:r>
+        <w:rPr>
+          <w:rFonts w:ascii="Montserrat Medium" w:eastAsiaTheme="majorEastAsia" w:hAnsi="Montserrat Medium" w:cstheme="majorBidi"/>
+          <w:bCs/>
+          <w:color w:val="auto"/>
+          <w:szCs w:val="24"/>
+        </w:rPr>
+        <w:t>.</w:t>
+      </w:r>
+      <w:r>
+        <w:rPr>
+          <w:rFonts w:ascii="Montserrat Medium" w:eastAsiaTheme="majorEastAsia" w:hAnsi="Montserrat Medium" w:cstheme="majorBidi"/>
+          <w:bCs/>
+          <w:color w:val="auto"/>
+          <w:szCs w:val="24"/>
+        </w:rPr>
+        <w:t>]</w:t>
+      </w:r>
+      <w:r>
+        <w:rPr>
+          <w:rFonts w:ascii="Montserrat Medium" w:eastAsiaTheme="majorEastAsia" w:hAnsi="Montserrat Medium" w:cstheme="majorBidi"/>
+          <w:bCs/>
+          <w:color w:val="auto"/>
+          <w:szCs w:val="24"/>
+        </w:rPr>
+        <w:t>masterchiefsgruntemporium</w:t>
+      </w:r>
+      <w:r>
+        <w:rPr>
+          <w:rFonts w:ascii="Montserrat Medium" w:eastAsiaTheme="majorEastAsia" w:hAnsi="Montserrat Medium" w:cstheme="majorBidi"/>
+          <w:bCs/>
+          <w:color w:val="auto"/>
+          <w:szCs w:val="24"/>
+        </w:rPr>
+        <w:t>[</w:t>
+      </w:r>
+      <w:r>
+        <w:rPr>
+          <w:rFonts w:ascii="Montserrat Medium" w:eastAsiaTheme="majorEastAsia" w:hAnsi="Montserrat Medium" w:cstheme="majorBidi"/>
+          <w:bCs/>
+          <w:color w:val="auto"/>
+          <w:szCs w:val="24"/>
+        </w:rPr>
+        <w:t>.</w:t>
+      </w:r>
+      <w:r>
+        <w:rPr>
+          <w:rFonts w:ascii="Montserrat Medium" w:eastAsiaTheme="majorEastAsia" w:hAnsi="Montserrat Medium" w:cstheme="majorBidi"/>
+          <w:bCs/>
+          <w:color w:val="auto"/>
+          <w:szCs w:val="24"/>
+        </w:rPr>
+        <w:t>]</w:t>
+      </w:r>
+      <w:r>
+        <w:rPr>
+          <w:rFonts w:ascii="Montserrat Medium" w:eastAsiaTheme="majorEastAsia" w:hAnsi="Montserrat Medium" w:cstheme="majorBidi"/>
+          <w:bCs/>
+          <w:color w:val="auto"/>
+          <w:szCs w:val="24"/>
+        </w:rPr>
+        <w:t>local:80</w:t>
       </w:r>
     </w:p>
     <w:p>
@@ -15151,13 +15241,8 @@
               <w:t>hxxp://</w:t>
             </w:r>
             <w:r>
-              <w:t xml:space="preserve"> </w:t>
-            </w:r>
-            <w:proofErr w:type="spellStart"/>
-            <w:r>
-              <w:t>srv</w:t>
-            </w:r>
-            <w:proofErr w:type="spellEnd"/>
+              <w:t xml:space="preserve"> srv</w:t>
+            </w:r>
             <w:r>
               <w:t>[</w:t>
             </w:r>
@@ -15167,11 +15252,9 @@
             <w:r>
               <w:t>]</w:t>
             </w:r>
-            <w:proofErr w:type="spellStart"/>
             <w:r>
               <w:t>masterchiefsgruntemporium</w:t>
             </w:r>
-            <w:proofErr w:type="spellEnd"/>
             <w:r>
               <w:t>[</w:t>
             </w:r>

</xml_diff>